<commit_message>
fix: Streamlit Cloud import bootstrap + disclosed-assumptions in docs
- dashboard: repo root onto sys.path + cwd pin — Data Provenance /
  weight sensitivity / campaign measurement crashed on Streamlit Cloud
  (ModuleNotFoundError: src.*); verified via AppTest from foreign cwd
- methodology v2.0: 'Disclosed Assumptions — Know Them Cold' section
  incl. the scripted weakest-data answer
- deck: 'Disclosed by design' strip on the trust slide + Q&A script in
  speaker notes
</commit_message>
<xml_diff>
--- a/SPPF_Methodology_v2.0.docx
+++ b/SPPF_Methodology_v2.0.docx
@@ -18510,6 +18510,202 @@
           <w:szCs w:val="22"/>
         </w:rPr>
         <w:t xml:space="preserve">County opportunity scores, tiers, percentiles, and the Trajectory dimension were fully recomputed after these corrections; the current Priority tier comprises 24 counties led by Starr, TX; Presidio, TX; Oglala Lakota, SD; Greene, AL; and Hidalgo, TX.</w:t>
+      </w:r>
+    </w:p>
+    <w:p>
+      <w:pPr>
+        <w:pStyle w:val="Heading2"/>
+      </w:pPr>
+      <w:r>
+        <w:t xml:space="preserve">Disclosed Assumptions — Know Them Cold</w:t>
+      </w:r>
+    </w:p>
+    <w:p>
+      <w:pPr>
+        <w:spacing w:after="140"/>
+      </w:pPr>
+      <w:r>
+        <w:rPr>
+          <w:rFonts w:ascii="Arial" w:cs="Arial" w:eastAsia="Arial" w:hAnsi="Arial"/>
+          <w:sz w:val="22"/>
+          <w:szCs w:val="22"/>
+        </w:rPr>
+        <w:t xml:space="preserve">SPPF’s credibility position is that every assumption is labeled in the product itself, not discovered by reviewers. The complete list of current assumptions, in the platform’s own words:</w:t>
+      </w:r>
+    </w:p>
+    <w:p>
+      <w:pPr>
+        <w:spacing w:after="140"/>
+      </w:pPr>
+      <w:r>
+        <w:rPr>
+          <w:rFonts w:ascii="Arial" w:cs="Arial" w:eastAsia="Arial" w:hAnsi="Arial"/>
+          <w:b/>
+          <w:bCs/>
+          <w:sz w:val="22"/>
+          <w:b/>
+          <w:bCs/>
+          <w:szCs w:val="22"/>
+        </w:rPr>
+        <w:t xml:space="preserve">Pool estimates: </w:t>
+      </w:r>
+      <w:r>
+        <w:rPr>
+          <w:rFonts w:ascii="Arial" w:cs="Arial" w:eastAsia="Arial" w:hAnsi="Arial"/>
+          <w:sz w:val="22"/>
+          <w:szCs w:val="22"/>
+        </w:rPr>
+        <w:t xml:space="preserve">published national undiagnosis rates (T2D 23.1%, hypertension ~20%, hypothyroidism ~50%) are applied uniformly to county prevalence. Actual county-level undiagnosis rates vary with factors not captured in public data; estimates are for relative market sizing only.</w:t>
+      </w:r>
+    </w:p>
+    <w:p>
+      <w:pPr>
+        <w:spacing w:after="140"/>
+      </w:pPr>
+      <w:r>
+        <w:rPr>
+          <w:rFonts w:ascii="Arial" w:cs="Arial" w:eastAsia="Arial" w:hAnsi="Arial"/>
+          <w:b/>
+          <w:bCs/>
+          <w:sz w:val="22"/>
+          <w:b/>
+          <w:bCs/>
+          <w:szCs w:val="22"/>
+        </w:rPr>
+        <w:t xml:space="preserve">Diagnosis Gap: </w:t>
+      </w:r>
+      <w:r>
+        <w:rPr>
+          <w:rFonts w:ascii="Arial" w:cs="Arial" w:eastAsia="Arial" w:hAnsi="Arial"/>
+          <w:sz w:val="22"/>
+          <w:szCs w:val="22"/>
+        </w:rPr>
+        <w:t xml:space="preserve">the dimension currently runs on its CDC-only fallback (prevalence, care-seeking, and affordability signals) because the full CMS Geographic Variation PUF endpoint is unavailable; only MA penetration is live CMS data. The scorer supports the Medicare detection-deficit signal the moment that download works — a data-refresh roadmap item, not a code change. The scorer also treats any zero-variance column as absent, so a filled national constant can never masquerade as a detection signal.</w:t>
+      </w:r>
+    </w:p>
+    <w:p>
+      <w:pPr>
+        <w:spacing w:after="140"/>
+      </w:pPr>
+      <w:r>
+        <w:rPr>
+          <w:rFonts w:ascii="Arial" w:cs="Arial" w:eastAsia="Arial" w:hAnsi="Arial"/>
+          <w:b/>
+          <w:bCs/>
+          <w:sz w:val="22"/>
+          <w:b/>
+          <w:bCs/>
+          <w:szCs w:val="22"/>
+        </w:rPr>
+        <w:t xml:space="preserve">Payer mix: </w:t>
+      </w:r>
+      <w:r>
+        <w:rPr>
+          <w:rFonts w:ascii="Arial" w:cs="Arial" w:eastAsia="Arial" w:hAnsi="Arial"/>
+          <w:sz w:val="22"/>
+          <w:szCs w:val="22"/>
+        </w:rPr>
+        <w:t xml:space="preserve">Medicare Advantage penetration is real county-level CMS data (3,108 of 3,128 counties). Medicaid share, commercial share, and dual-eligible share are modeled estimates derived from SES signals and coverage arithmetic — directionally sound planning figures, labeled as modeled in the dashboard.</w:t>
+      </w:r>
+    </w:p>
+    <w:p>
+      <w:pPr>
+        <w:spacing w:after="140"/>
+      </w:pPr>
+      <w:r>
+        <w:rPr>
+          <w:rFonts w:ascii="Arial" w:cs="Arial" w:eastAsia="Arial" w:hAnsi="Arial"/>
+          <w:b/>
+          <w:bCs/>
+          <w:sz w:val="22"/>
+          <w:b/>
+          <w:bCs/>
+          <w:szCs w:val="22"/>
+        </w:rPr>
+        <w:t xml:space="preserve">ZIP downscaling: </w:t>
+      </w:r>
+      <w:r>
+        <w:rPr>
+          <w:rFonts w:ascii="Arial" w:cs="Arial" w:eastAsia="Arial" w:hAnsi="Arial"/>
+          <w:sz w:val="22"/>
+          <w:szCs w:val="22"/>
+        </w:rPr>
+        <w:t xml:space="preserve">Payer Landscape, Commercial Readiness, and Trajectory at ZIP level are county scores downscaled via the Census crosswalk; only Disease Burden and Social Determinants use direct ZCTA-level source data.</w:t>
+      </w:r>
+    </w:p>
+    <w:p>
+      <w:pPr>
+        <w:spacing w:after="140"/>
+      </w:pPr>
+      <w:r>
+        <w:rPr>
+          <w:rFonts w:ascii="Arial" w:cs="Arial" w:eastAsia="Arial" w:hAnsi="Arial"/>
+          <w:b/>
+          <w:bCs/>
+          <w:sz w:val="22"/>
+          <w:b/>
+          <w:bCs/>
+          <w:szCs w:val="22"/>
+        </w:rPr>
+        <w:t xml:space="preserve">Hypothyroidism: </w:t>
+      </w:r>
+      <w:r>
+        <w:rPr>
+          <w:rFonts w:ascii="Arial" w:cs="Arial" w:eastAsia="Arial" w:hAnsi="Arial"/>
+          <w:sz w:val="22"/>
+          <w:szCs w:val="22"/>
+        </w:rPr>
+        <w:t xml:space="preserve">no public dataset provides county-level thyroid measures, so the hypothyroidism geography ranking is a proxy blend of Diagnosis Gap (60%) and Access to Care (40%) — labeled as such in the condition tooltip. Lab-ordering data is the roadmap fix.</w:t>
+      </w:r>
+    </w:p>
+    <w:p>
+      <w:pPr>
+        <w:spacing w:after="140"/>
+      </w:pPr>
+      <w:r>
+        <w:rPr>
+          <w:rFonts w:ascii="Arial" w:cs="Arial" w:eastAsia="Arial" w:hAnsi="Arial"/>
+          <w:b/>
+          <w:bCs/>
+          <w:sz w:val="22"/>
+          <w:b/>
+          <w:bCs/>
+          <w:szCs w:val="22"/>
+        </w:rPr>
+        <w:t xml:space="preserve">Weights: </w:t>
+      </w:r>
+      <w:r>
+        <w:rPr>
+          <w:rFonts w:ascii="Arial" w:cs="Arial" w:eastAsia="Arial" w:hAnsi="Arial"/>
+          <w:sz w:val="22"/>
+          <w:szCs w:val="22"/>
+        </w:rPr>
+        <w:t xml:space="preserve">dimension weights and HCP specialty-fit weights are judgment calls. They are defended empirically rather than asserted: the dashboard’s weight-sensitivity panel shows the ranking holds under any need-side re-weighting (Spearman 0.97–0.99, top-50 overlap 82–88%).</w:t>
+      </w:r>
+    </w:p>
+    <w:p>
+      <w:pPr>
+        <w:spacing w:after="140"/>
+      </w:pPr>
+      <w:r>
+        <w:rPr>
+          <w:rFonts w:ascii="Arial" w:cs="Arial" w:eastAsia="Arial" w:hAnsi="Arial"/>
+          <w:b/>
+          <w:bCs/>
+          <w:sz w:val="22"/>
+          <w:b/>
+          <w:bCs/>
+          <w:szCs w:val="22"/>
+        </w:rPr>
+        <w:t xml:space="preserve">If asked what the weakest part of the data is: </w:t>
+      </w:r>
+      <w:r>
+        <w:rPr>
+          <w:rFonts w:ascii="Arial" w:cs="Arial" w:eastAsia="Arial" w:hAnsi="Arial"/>
+          <w:sz w:val="22"/>
+          <w:szCs w:val="22"/>
+        </w:rPr>
+        <w:t xml:space="preserve">“Payer mix beyond MA penetration is modeled, and hypothyroidism is a proxy — both labeled as such in the app. That is why the provenance page exists: we would rather show you the seams than have you find them.” Honesty as a feature.</w:t>
       </w:r>
     </w:p>
     <w:sectPr>

</xml_diff>

<commit_message>
docs: plain-English overview at front of methodology + sync stale v1 counts (3,144 counties / 33,791 ZIPs)
</commit_message>
<xml_diff>
--- a/SPPF_Methodology_v2.0.docx
+++ b/SPPF_Methodology_v2.0.docx
@@ -217,6 +217,224 @@
           <w:szCs w:val="22"/>
         </w:rPr>
         <w:t xml:space="preserve"/>
+      </w:r>
+    </w:p>
+    <w:tbl>
+      <w:tblPr>
+        <w:tblW w:type="dxa" w:w="9720"/>
+      </w:tblPr>
+      <w:tblGrid>
+        <w:gridCol w:w="9720"/>
+      </w:tblGrid>
+      <w:tr>
+        <w:tc>
+          <w:tcPr>
+            <w:tcW w:type="dxa" w:w="9720"/>
+            <w:shd w:fill="1B3A5C" w:val="clear"/>
+            <w:tcMar>
+              <w:top w:type="dxa" w:w="180"/>
+              <w:left w:type="dxa" w:w="240"/>
+              <w:bottom w:type="dxa" w:w="180"/>
+              <w:right w:type="dxa" w:w="240"/>
+            </w:tcMar>
+          </w:tcPr>
+          <w:p>
+            <w:pPr>
+              <w:spacing w:after="0" w:before="0"/>
+            </w:pPr>
+            <w:r>
+              <w:rPr>
+                <w:rFonts w:ascii="Arial" w:cs="Arial" w:eastAsia="Arial" w:hAnsi="Arial"/>
+                <w:b/>
+                <w:bCs/>
+                <w:color w:val="FFFFFF"/>
+                <w:sz w:val="30"/>
+                <w:szCs w:val="30"/>
+              </w:rPr>
+              <w:t xml:space="preserve">PLAIN-ENGLISH OVERVIEW  —  START HERE</w:t>
+            </w:r>
+          </w:p>
+        </w:tc>
+      </w:tr>
+    </w:tbl>
+    <w:p>
+      <w:pPr>
+        <w:spacing w:after="120"/>
+      </w:pPr>
+    </w:p>
+    <w:p>
+      <w:pPr>
+        <w:spacing w:after="160"/>
+      </w:pPr>
+      <w:r>
+        <w:rPr>
+          <w:rFonts w:ascii="Arial" w:cs="Arial" w:eastAsia="Arial" w:hAnsi="Arial"/>
+          <w:b/>
+          <w:bCs/>
+          <w:sz w:val="22"/>
+          <w:b/>
+          <w:bCs/>
+          <w:szCs w:val="22"/>
+        </w:rPr>
+        <w:t xml:space="preserve">Who this page is for: </w:t>
+      </w:r>
+      <w:r>
+        <w:rPr>
+          <w:rFonts w:ascii="Arial" w:cs="Arial" w:eastAsia="Arial" w:hAnsi="Arial"/>
+          <w:sz w:val="22"/>
+          <w:szCs w:val="22"/>
+        </w:rPr>
+        <w:t xml:space="preserve">This page explains the whole platform without jargon. The rest of the document is the technical reference; everything here is expanded there.</w:t>
+      </w:r>
+    </w:p>
+    <w:p>
+      <w:pPr>
+        <w:spacing w:after="160"/>
+      </w:pPr>
+      <w:r>
+        <w:rPr>
+          <w:rFonts w:ascii="Arial" w:cs="Arial" w:eastAsia="Arial" w:hAnsi="Arial"/>
+          <w:b/>
+          <w:bCs/>
+          <w:sz w:val="22"/>
+          <w:b/>
+          <w:bCs/>
+          <w:szCs w:val="22"/>
+        </w:rPr>
+        <w:t xml:space="preserve">The problem in one paragraph. </w:t>
+      </w:r>
+      <w:r>
+        <w:rPr>
+          <w:rFonts w:ascii="Arial" w:cs="Arial" w:eastAsia="Arial" w:hAnsi="Arial"/>
+          <w:sz w:val="22"/>
+          <w:szCs w:val="22"/>
+        </w:rPr>
+        <w:t xml:space="preserve">Millions of Americans have diabetes, high blood pressure, or thyroid disease and don’t know it. Because they’ve never been diagnosed, they never appear in any medical database — no diagnosis, no prescription, no insurance claim. To every conventional healthcare dataset, they are invisible. Yet finding them matters enormously: every year a condition goes undiagnosed, the patient gets sicker and treatment gets harder and more expensive.</w:t>
+      </w:r>
+    </w:p>
+    <w:p>
+      <w:pPr>
+        <w:spacing w:after="160"/>
+      </w:pPr>
+      <w:r>
+        <w:rPr>
+          <w:rFonts w:ascii="Arial" w:cs="Arial" w:eastAsia="Arial" w:hAnsi="Arial"/>
+          <w:b/>
+          <w:bCs/>
+          <w:sz w:val="22"/>
+          <w:b/>
+          <w:bCs/>
+          <w:szCs w:val="22"/>
+        </w:rPr>
+        <w:t xml:space="preserve">The idea in one paragraph. </w:t>
+      </w:r>
+      <w:r>
+        <w:rPr>
+          <w:rFonts w:ascii="Arial" w:cs="Arial" w:eastAsia="Arial" w:hAnsi="Arial"/>
+          <w:sz w:val="22"/>
+          <w:szCs w:val="22"/>
+        </w:rPr>
+        <w:t xml:space="preserve">You can’t see an undiagnosed individual, but you can see the places where many of them almost certainly live. Public government statistics tell us, county by county: how common diabetes is, how many people are obese or live in poverty, how many skip annual checkups, whether there’s a doctor shortage, and whether people can afford care. Where several of these signals stack up — lots of disease risk, weak detection systems, barriers to care — undiagnosed people concentrate. It’s the same logic a public-health agency uses, pointed at a commercial planning question.</w:t>
+      </w:r>
+    </w:p>
+    <w:p>
+      <w:pPr>
+        <w:spacing w:after="160"/>
+      </w:pPr>
+      <w:r>
+        <w:rPr>
+          <w:rFonts w:ascii="Arial" w:cs="Arial" w:eastAsia="Arial" w:hAnsi="Arial"/>
+          <w:b/>
+          <w:bCs/>
+          <w:sz w:val="22"/>
+          <w:b/>
+          <w:bCs/>
+          <w:szCs w:val="22"/>
+        </w:rPr>
+        <w:t xml:space="preserve">The analogy that explains the scoring. </w:t>
+      </w:r>
+      <w:r>
+        <w:rPr>
+          <w:rFonts w:ascii="Arial" w:cs="Arial" w:eastAsia="Arial" w:hAnsi="Arial"/>
+          <w:sz w:val="22"/>
+          <w:szCs w:val="22"/>
+        </w:rPr>
+        <w:t xml:space="preserve">Think of it like a weather forecast for hidden disease. No forecast can say which raindrop will hit your house, and SPPF never says which person is undiagnosed. But it can say with confidence where it’s going to pour. Each of the 3,144 US counties gets a score built from seven ’weather instruments’ — the seven dimensions described in this document — and the counties are ranked from most to least promising.</w:t>
+      </w:r>
+    </w:p>
+    <w:p>
+      <w:pPr>
+        <w:spacing w:after="160"/>
+      </w:pPr>
+      <w:r>
+        <w:rPr>
+          <w:rFonts w:ascii="Arial" w:cs="Arial" w:eastAsia="Arial" w:hAnsi="Arial"/>
+          <w:b/>
+          <w:bCs/>
+          <w:sz w:val="22"/>
+          <w:b/>
+          <w:bCs/>
+          <w:szCs w:val="22"/>
+        </w:rPr>
+        <w:t xml:space="preserve">What comes out of it — three things. </w:t>
+      </w:r>
+      <w:r>
+        <w:rPr>
+          <w:rFonts w:ascii="Arial" w:cs="Arial" w:eastAsia="Arial" w:hAnsi="Arial"/>
+          <w:sz w:val="22"/>
+          <w:szCs w:val="22"/>
+        </w:rPr>
+        <w:t xml:space="preserve">(1) A ranked map: every US county and ZIP code scored 0–100, with a percentile — ’this county beats 94% of the country’ — and a data-quality grade of A, B, or C that says how much real data backs that score. (2) A doctor list: from public Medicare statistics, the primary-care doctors whose patient panels and locations suggest they’re best placed to find undiagnosed people — ranked, with a plain-English reason for each. (3) A report card: after a health campaign runs in chosen counties, the platform compares them against statistically similar counties that had no campaign, and measures whether diagnosis rates actually rose. That’s the same logic clinical trials use — a treated group versus a control group.</w:t>
+      </w:r>
+    </w:p>
+    <w:p>
+      <w:pPr>
+        <w:spacing w:after="160"/>
+      </w:pPr>
+      <w:r>
+        <w:rPr>
+          <w:rFonts w:ascii="Arial" w:cs="Arial" w:eastAsia="Arial" w:hAnsi="Arial"/>
+          <w:b/>
+          <w:bCs/>
+          <w:sz w:val="22"/>
+          <w:b/>
+          <w:bCs/>
+          <w:szCs w:val="22"/>
+        </w:rPr>
+        <w:t xml:space="preserve">What it deliberately does NOT do. </w:t>
+      </w:r>
+      <w:r>
+        <w:rPr>
+          <w:rFonts w:ascii="Arial" w:cs="Arial" w:eastAsia="Arial" w:hAnsi="Arial"/>
+          <w:sz w:val="22"/>
+          <w:szCs w:val="22"/>
+        </w:rPr>
+        <w:t xml:space="preserve">It never uses medical records, insurance claims, or any information about individual patients. Every input is a public, aggregate government statistic — the kind anyone can download. It cannot identify, and never tries to identify, any person. It is a planning tool that answers ’where should we run a screening program?’ — not a diagnostic tool.</w:t>
+      </w:r>
+    </w:p>
+    <w:p>
+      <w:pPr>
+        <w:spacing w:after="160"/>
+      </w:pPr>
+      <w:r>
+        <w:rPr>
+          <w:rFonts w:ascii="Arial" w:cs="Arial" w:eastAsia="Arial" w:hAnsi="Arial"/>
+          <w:b/>
+          <w:bCs/>
+          <w:sz w:val="22"/>
+          <w:b/>
+          <w:bCs/>
+          <w:szCs w:val="22"/>
+        </w:rPr>
+        <w:t xml:space="preserve">What’s an estimate and what’s measured. </w:t>
+      </w:r>
+      <w:r>
+        <w:rPr>
+          <w:rFonts w:ascii="Arial" w:cs="Arial" w:eastAsia="Arial" w:hAnsi="Arial"/>
+          <w:sz w:val="22"/>
+          <w:szCs w:val="22"/>
+        </w:rPr>
+        <w:t xml:space="preserve">Estimates of hidden-patient counts use national averages applied locally (labeled as estimates). A few sub-signals are modeled rather than measured, and they’re labeled that way in the app. Where judgment calls exist — like how much weight each of the seven dimensions gets — the dashboard lets a skeptic change them live and watch the ranking barely move. The guiding principle throughout: show the seams rather than hide them.</w:t>
       </w:r>
     </w:p>
     <w:tbl>
@@ -377,7 +595,7 @@
                 <w:sz w:val="56"/>
                 <w:szCs w:val="56"/>
               </w:rPr>
-              <w:t xml:space="preserve">3,143</w:t>
+              <w:t xml:space="preserve">3,144</w:t>
             </w:r>
           </w:p>
           <w:p>
@@ -428,7 +646,7 @@
                 <w:sz w:val="56"/>
                 <w:szCs w:val="56"/>
               </w:rPr>
-              <w:t xml:space="preserve">33,774</w:t>
+              <w:t xml:space="preserve">33,791</w:t>
             </w:r>
           </w:p>
           <w:p>
@@ -2189,7 +2407,7 @@
                 <w:sz w:val="20"/>
                 <w:szCs w:val="20"/>
               </w:rPr>
-              <w:t xml:space="preserve">3,143</w:t>
+              <w:t xml:space="preserve">3,144</w:t>
             </w:r>
           </w:p>
         </w:tc>
@@ -2319,7 +2537,7 @@
                 <w:sz w:val="20"/>
                 <w:szCs w:val="20"/>
               </w:rPr>
-              <w:t xml:space="preserve">33,774</w:t>
+              <w:t xml:space="preserve">33,791</w:t>
             </w:r>
           </w:p>
         </w:tc>
@@ -11938,7 +12156,7 @@
           <w:sz w:val="22"/>
           <w:szCs w:val="22"/>
         </w:rPr>
-        <w:t xml:space="preserve">CDC PLACES county coverage: all 3,143 US counties and county equivalents, plus 33,774 ZCTAs.</w:t>
+        <w:t xml:space="preserve">CDC PLACES county coverage: all 3,144 US counties and county equivalents, plus 33,791 ZCTAs.</w:t>
       </w:r>
     </w:p>
     <w:p>
@@ -13938,7 +14156,7 @@
           <w:sz w:val="22"/>
           <w:szCs w:val="22"/>
         </w:rPr>
-        <w:t xml:space="preserve">The ZIP &amp; Territory view extends county-level intelligence to the sub-county geography used by field teams, payer network maps, and provider organizations. SPPF scores all 33,774 US ZIP Code Tabulation Areas (ZCTAs) across the same seven dimensions as counties, enabling field teams to define custom territories and receive instant scorecard outputs.</w:t>
+        <w:t xml:space="preserve">The ZIP &amp; Territory view extends county-level intelligence to the sub-county geography used by field teams, payer network maps, and provider organizations. SPPF scores all 33,791 US ZIP Code Tabulation Areas (ZCTAs) across the same seven dimensions as counties, enabling field teams to define custom territories and receive instant scorecard outputs.</w:t>
       </w:r>
     </w:p>
     <w:p>
@@ -13991,7 +14209,7 @@
           <w:sz w:val="22"/>
           <w:szCs w:val="22"/>
         </w:rPr>
-        <w:t xml:space="preserve">Disease Burden and Social Determinants use real CDC PLACES and Census ACS ZCTA-level data, where available. CDC PLACES publishes chronic disease prevalence at the ZCTA level for all 33,774 ZCTAs as part of the PLACES 2024 release.</w:t>
+        <w:t xml:space="preserve">Disease Burden and Social Determinants use real CDC PLACES and Census ACS ZCTA-level data, where available. CDC PLACES publishes chronic disease prevalence at the ZCTA level for all 33,791 ZCTAs as part of the PLACES 2024 release.</w:t>
       </w:r>
     </w:p>
     <w:p>
@@ -14033,7 +14251,7 @@
           <w:sz w:val="22"/>
           <w:szCs w:val="22"/>
         </w:rPr>
-        <w:t xml:space="preserve">ZIP centroids (latitude/longitude) are sourced from the Census Bureau Gazetteer ZCTA file, enabling geographic mapping of all 33,774 ZCTAs on a Plotly scatter_geo map using the Albers USA projection.</w:t>
+        <w:t xml:space="preserve">ZIP centroids (latitude/longitude) are sourced from the Census Bureau Gazetteer ZCTA file, enabling geographic mapping of all 33,791 ZCTAs on a Plotly scatter_geo map using the Albers USA projection.</w:t>
       </w:r>
     </w:p>
     <w:p>

</xml_diff>

<commit_message>
refactor: address code review — restructure ingestion, split dashboard, harden TLS, unify deps, expand tests
</commit_message>
<xml_diff>
--- a/SPPF_Methodology_v2.0.docx
+++ b/SPPF_Methodology_v2.0.docx
@@ -18924,6 +18924,2588 @@
           <w:szCs w:val="22"/>
         </w:rPr>
         <w:t xml:space="preserve">“Payer mix beyond MA penetration is modeled, and hypothyroidism is a proxy — both labeled as such in the app. That is why the provenance page exists: we would rather show you the seams than have you find them.” Honesty as a feature.</w:t>
+      </w:r>
+    </w:p>
+    <w:p>
+      <w:pPr>
+        <w:pStyle w:val="Heading1"/>
+      </w:pPr>
+      <w:r>
+        <w:t>Part III — Predictive Validation &amp; Model Defensibility (v2.1)</w:t>
+      </w:r>
+    </w:p>
+    <w:p>
+      <w:r>
+        <w:rPr>
+          <w:i w:val="0"/>
+          <w:sz w:val="22"/>
+        </w:rPr>
+        <w:t>Part I defines the score and Part II hardens the platform. Part III answers the only question a technical reviewer ultimately asks: does the score beat what any analyst could build in a spreadsheet, and does its headline number survive scrutiny? Every test below is designed to be disprovable and is reported as lift over a naive baseline. Tests labeled (public data) run today on data already in the repository and should be complete before the first presentation. Tests labeled (claims-calibrated) require the backdated IQVIA extract described in III.8 and are the explicit ask of that presentation.</w:t>
+      </w:r>
+    </w:p>
+    <w:p>
+      <w:pPr>
+        <w:pStyle w:val="Heading2"/>
+      </w:pPr>
+      <w:r>
+        <w:t>III.1  The Baseline-Lift Principle</w:t>
+      </w:r>
+    </w:p>
+    <w:p>
+      <w:r>
+        <w:rPr>
+          <w:b/>
+          <w:sz w:val="22"/>
+        </w:rPr>
+        <w:t xml:space="preserve">The principle. </w:t>
+      </w:r>
+      <w:r>
+        <w:rPr>
+          <w:sz w:val="22"/>
+        </w:rPr>
+        <w:t>No validation number is reported in isolation. Every metric is stated as lift over a naive baseline any analyst could build in five minutes: rank geographies by raw population multiplied by published prevalence. The seven-dimension composite is justified only to the extent it beats that baseline. Because the product is a ranking, agreement is measured with Spearman rank correlation and Kendall tau — not Pearson.</w:t>
+      </w:r>
+    </w:p>
+    <w:tbl>
+      <w:tblPr>
+        <w:tblW w:type="auto" w:w="0"/>
+        <w:tblLook w:firstColumn="1" w:firstRow="1" w:lastColumn="0" w:lastRow="0" w:noHBand="0" w:noVBand="1" w:val="04A0"/>
+      </w:tblPr>
+      <w:tblGrid>
+        <w:gridCol w:w="1620"/>
+        <w:gridCol w:w="1620"/>
+        <w:gridCol w:w="1620"/>
+        <w:gridCol w:w="1620"/>
+        <w:gridCol w:w="1620"/>
+        <w:gridCol w:w="1620"/>
+      </w:tblGrid>
+      <w:tr>
+        <w:tc>
+          <w:tcPr>
+            <w:tcW w:type="dxa" w:w="1620"/>
+            <w:tcBorders>
+              <w:top w:val="single" w:sz="4" w:space="0" w:color="BFBFBF"/>
+              <w:left w:val="single" w:sz="4" w:space="0" w:color="BFBFBF"/>
+              <w:bottom w:val="single" w:sz="4" w:space="0" w:color="BFBFBF"/>
+              <w:right w:val="single" w:sz="4" w:space="0" w:color="BFBFBF"/>
+            </w:tcBorders>
+          </w:tcPr>
+          <w:p>
+            <w:r/>
+            <w:r>
+              <w:rPr>
+                <w:b/>
+                <w:sz w:val="19"/>
+              </w:rPr>
+              <w:t>Metric</w:t>
+            </w:r>
+          </w:p>
+        </w:tc>
+        <w:tc>
+          <w:tcPr>
+            <w:tcW w:type="dxa" w:w="1620"/>
+            <w:tcBorders>
+              <w:top w:val="single" w:sz="4" w:space="0" w:color="BFBFBF"/>
+              <w:left w:val="single" w:sz="4" w:space="0" w:color="BFBFBF"/>
+              <w:bottom w:val="single" w:sz="4" w:space="0" w:color="BFBFBF"/>
+              <w:right w:val="single" w:sz="4" w:space="0" w:color="BFBFBF"/>
+            </w:tcBorders>
+          </w:tcPr>
+          <w:p>
+            <w:r/>
+            <w:r>
+              <w:rPr>
+                <w:b/>
+                <w:sz w:val="19"/>
+              </w:rPr>
+              <w:t>Naive baseline</w:t>
+            </w:r>
+          </w:p>
+        </w:tc>
+        <w:tc>
+          <w:tcPr>
+            <w:tcW w:type="dxa" w:w="1620"/>
+            <w:tcBorders>
+              <w:top w:val="single" w:sz="4" w:space="0" w:color="BFBFBF"/>
+              <w:left w:val="single" w:sz="4" w:space="0" w:color="BFBFBF"/>
+              <w:bottom w:val="single" w:sz="4" w:space="0" w:color="BFBFBF"/>
+              <w:right w:val="single" w:sz="4" w:space="0" w:color="BFBFBF"/>
+            </w:tcBorders>
+          </w:tcPr>
+          <w:p>
+            <w:r/>
+            <w:r>
+              <w:rPr>
+                <w:b/>
+                <w:sz w:val="19"/>
+              </w:rPr>
+              <w:t>SPPF composite</w:t>
+            </w:r>
+          </w:p>
+        </w:tc>
+        <w:tc>
+          <w:tcPr>
+            <w:tcW w:type="dxa" w:w="1620"/>
+            <w:tcBorders>
+              <w:top w:val="single" w:sz="4" w:space="0" w:color="BFBFBF"/>
+              <w:left w:val="single" w:sz="4" w:space="0" w:color="BFBFBF"/>
+              <w:bottom w:val="single" w:sz="4" w:space="0" w:color="BFBFBF"/>
+              <w:right w:val="single" w:sz="4" w:space="0" w:color="BFBFBF"/>
+            </w:tcBorders>
+          </w:tcPr>
+          <w:p>
+            <w:r/>
+            <w:r>
+              <w:rPr>
+                <w:b/>
+                <w:sz w:val="19"/>
+              </w:rPr>
+              <w:t>Lift (Δ)</w:t>
+            </w:r>
+          </w:p>
+        </w:tc>
+        <w:tc>
+          <w:tcPr>
+            <w:tcW w:type="dxa" w:w="1620"/>
+            <w:tcBorders>
+              <w:top w:val="single" w:sz="4" w:space="0" w:color="BFBFBF"/>
+              <w:left w:val="single" w:sz="4" w:space="0" w:color="BFBFBF"/>
+              <w:bottom w:val="single" w:sz="4" w:space="0" w:color="BFBFBF"/>
+              <w:right w:val="single" w:sz="4" w:space="0" w:color="BFBFBF"/>
+            </w:tcBorders>
+          </w:tcPr>
+          <w:p>
+            <w:r/>
+            <w:r>
+              <w:rPr>
+                <w:b/>
+                <w:sz w:val="19"/>
+              </w:rPr>
+              <w:t>p-value</w:t>
+            </w:r>
+          </w:p>
+        </w:tc>
+        <w:tc>
+          <w:tcPr>
+            <w:tcW w:type="dxa" w:w="1620"/>
+            <w:tcBorders>
+              <w:top w:val="single" w:sz="4" w:space="0" w:color="BFBFBF"/>
+              <w:left w:val="single" w:sz="4" w:space="0" w:color="BFBFBF"/>
+              <w:bottom w:val="single" w:sz="4" w:space="0" w:color="BFBFBF"/>
+              <w:right w:val="single" w:sz="4" w:space="0" w:color="BFBFBF"/>
+            </w:tcBorders>
+          </w:tcPr>
+          <w:p>
+            <w:r/>
+            <w:r>
+              <w:rPr>
+                <w:b/>
+                <w:sz w:val="19"/>
+              </w:rPr>
+              <w:t>n</w:t>
+            </w:r>
+          </w:p>
+        </w:tc>
+      </w:tr>
+      <w:tr>
+        <w:tc>
+          <w:tcPr>
+            <w:tcW w:type="dxa" w:w="1620"/>
+            <w:tcBorders>
+              <w:top w:val="single" w:sz="4" w:space="0" w:color="BFBFBF"/>
+              <w:left w:val="single" w:sz="4" w:space="0" w:color="BFBFBF"/>
+              <w:bottom w:val="single" w:sz="4" w:space="0" w:color="BFBFBF"/>
+              <w:right w:val="single" w:sz="4" w:space="0" w:color="BFBFBF"/>
+            </w:tcBorders>
+          </w:tcPr>
+          <w:p>
+            <w:r/>
+            <w:r>
+              <w:rPr>
+                <w:sz w:val="19"/>
+              </w:rPr>
+              <w:t>Spearman ρ vs realized outcome</w:t>
+            </w:r>
+          </w:p>
+        </w:tc>
+        <w:tc>
+          <w:tcPr>
+            <w:tcW w:type="dxa" w:w="1620"/>
+            <w:tcBorders>
+              <w:top w:val="single" w:sz="4" w:space="0" w:color="BFBFBF"/>
+              <w:left w:val="single" w:sz="4" w:space="0" w:color="BFBFBF"/>
+              <w:bottom w:val="single" w:sz="4" w:space="0" w:color="BFBFBF"/>
+              <w:right w:val="single" w:sz="4" w:space="0" w:color="BFBFBF"/>
+            </w:tcBorders>
+          </w:tcPr>
+          <w:p>
+            <w:r/>
+            <w:r>
+              <w:rPr>
+                <w:sz w:val="19"/>
+              </w:rPr>
+              <w:t>___</w:t>
+            </w:r>
+          </w:p>
+        </w:tc>
+        <w:tc>
+          <w:tcPr>
+            <w:tcW w:type="dxa" w:w="1620"/>
+            <w:tcBorders>
+              <w:top w:val="single" w:sz="4" w:space="0" w:color="BFBFBF"/>
+              <w:left w:val="single" w:sz="4" w:space="0" w:color="BFBFBF"/>
+              <w:bottom w:val="single" w:sz="4" w:space="0" w:color="BFBFBF"/>
+              <w:right w:val="single" w:sz="4" w:space="0" w:color="BFBFBF"/>
+            </w:tcBorders>
+          </w:tcPr>
+          <w:p>
+            <w:r/>
+            <w:r>
+              <w:rPr>
+                <w:sz w:val="19"/>
+              </w:rPr>
+              <w:t>___</w:t>
+            </w:r>
+          </w:p>
+        </w:tc>
+        <w:tc>
+          <w:tcPr>
+            <w:tcW w:type="dxa" w:w="1620"/>
+            <w:tcBorders>
+              <w:top w:val="single" w:sz="4" w:space="0" w:color="BFBFBF"/>
+              <w:left w:val="single" w:sz="4" w:space="0" w:color="BFBFBF"/>
+              <w:bottom w:val="single" w:sz="4" w:space="0" w:color="BFBFBF"/>
+              <w:right w:val="single" w:sz="4" w:space="0" w:color="BFBFBF"/>
+            </w:tcBorders>
+          </w:tcPr>
+          <w:p>
+            <w:r/>
+            <w:r>
+              <w:rPr>
+                <w:sz w:val="19"/>
+              </w:rPr>
+              <w:t>___</w:t>
+            </w:r>
+          </w:p>
+        </w:tc>
+        <w:tc>
+          <w:tcPr>
+            <w:tcW w:type="dxa" w:w="1620"/>
+            <w:tcBorders>
+              <w:top w:val="single" w:sz="4" w:space="0" w:color="BFBFBF"/>
+              <w:left w:val="single" w:sz="4" w:space="0" w:color="BFBFBF"/>
+              <w:bottom w:val="single" w:sz="4" w:space="0" w:color="BFBFBF"/>
+              <w:right w:val="single" w:sz="4" w:space="0" w:color="BFBFBF"/>
+            </w:tcBorders>
+          </w:tcPr>
+          <w:p>
+            <w:r/>
+            <w:r>
+              <w:rPr>
+                <w:sz w:val="19"/>
+              </w:rPr>
+              <w:t>___</w:t>
+            </w:r>
+          </w:p>
+        </w:tc>
+        <w:tc>
+          <w:tcPr>
+            <w:tcW w:type="dxa" w:w="1620"/>
+            <w:tcBorders>
+              <w:top w:val="single" w:sz="4" w:space="0" w:color="BFBFBF"/>
+              <w:left w:val="single" w:sz="4" w:space="0" w:color="BFBFBF"/>
+              <w:bottom w:val="single" w:sz="4" w:space="0" w:color="BFBFBF"/>
+              <w:right w:val="single" w:sz="4" w:space="0" w:color="BFBFBF"/>
+            </w:tcBorders>
+          </w:tcPr>
+          <w:p>
+            <w:r/>
+            <w:r>
+              <w:rPr>
+                <w:sz w:val="19"/>
+              </w:rPr>
+              <w:t>___</w:t>
+            </w:r>
+          </w:p>
+        </w:tc>
+      </w:tr>
+      <w:tr>
+        <w:tc>
+          <w:tcPr>
+            <w:tcW w:type="dxa" w:w="1620"/>
+            <w:tcBorders>
+              <w:top w:val="single" w:sz="4" w:space="0" w:color="BFBFBF"/>
+              <w:left w:val="single" w:sz="4" w:space="0" w:color="BFBFBF"/>
+              <w:bottom w:val="single" w:sz="4" w:space="0" w:color="BFBFBF"/>
+              <w:right w:val="single" w:sz="4" w:space="0" w:color="BFBFBF"/>
+            </w:tcBorders>
+          </w:tcPr>
+          <w:p>
+            <w:r/>
+            <w:r>
+              <w:rPr>
+                <w:sz w:val="19"/>
+              </w:rPr>
+              <w:t>Kendall τ vs realized outcome</w:t>
+            </w:r>
+          </w:p>
+        </w:tc>
+        <w:tc>
+          <w:tcPr>
+            <w:tcW w:type="dxa" w:w="1620"/>
+            <w:tcBorders>
+              <w:top w:val="single" w:sz="4" w:space="0" w:color="BFBFBF"/>
+              <w:left w:val="single" w:sz="4" w:space="0" w:color="BFBFBF"/>
+              <w:bottom w:val="single" w:sz="4" w:space="0" w:color="BFBFBF"/>
+              <w:right w:val="single" w:sz="4" w:space="0" w:color="BFBFBF"/>
+            </w:tcBorders>
+          </w:tcPr>
+          <w:p>
+            <w:r/>
+            <w:r>
+              <w:rPr>
+                <w:sz w:val="19"/>
+              </w:rPr>
+              <w:t>___</w:t>
+            </w:r>
+          </w:p>
+        </w:tc>
+        <w:tc>
+          <w:tcPr>
+            <w:tcW w:type="dxa" w:w="1620"/>
+            <w:tcBorders>
+              <w:top w:val="single" w:sz="4" w:space="0" w:color="BFBFBF"/>
+              <w:left w:val="single" w:sz="4" w:space="0" w:color="BFBFBF"/>
+              <w:bottom w:val="single" w:sz="4" w:space="0" w:color="BFBFBF"/>
+              <w:right w:val="single" w:sz="4" w:space="0" w:color="BFBFBF"/>
+            </w:tcBorders>
+          </w:tcPr>
+          <w:p>
+            <w:r/>
+            <w:r>
+              <w:rPr>
+                <w:sz w:val="19"/>
+              </w:rPr>
+              <w:t>___</w:t>
+            </w:r>
+          </w:p>
+        </w:tc>
+        <w:tc>
+          <w:tcPr>
+            <w:tcW w:type="dxa" w:w="1620"/>
+            <w:tcBorders>
+              <w:top w:val="single" w:sz="4" w:space="0" w:color="BFBFBF"/>
+              <w:left w:val="single" w:sz="4" w:space="0" w:color="BFBFBF"/>
+              <w:bottom w:val="single" w:sz="4" w:space="0" w:color="BFBFBF"/>
+              <w:right w:val="single" w:sz="4" w:space="0" w:color="BFBFBF"/>
+            </w:tcBorders>
+          </w:tcPr>
+          <w:p>
+            <w:r/>
+            <w:r>
+              <w:rPr>
+                <w:sz w:val="19"/>
+              </w:rPr>
+              <w:t>___</w:t>
+            </w:r>
+          </w:p>
+        </w:tc>
+        <w:tc>
+          <w:tcPr>
+            <w:tcW w:type="dxa" w:w="1620"/>
+            <w:tcBorders>
+              <w:top w:val="single" w:sz="4" w:space="0" w:color="BFBFBF"/>
+              <w:left w:val="single" w:sz="4" w:space="0" w:color="BFBFBF"/>
+              <w:bottom w:val="single" w:sz="4" w:space="0" w:color="BFBFBF"/>
+              <w:right w:val="single" w:sz="4" w:space="0" w:color="BFBFBF"/>
+            </w:tcBorders>
+          </w:tcPr>
+          <w:p>
+            <w:r/>
+            <w:r>
+              <w:rPr>
+                <w:sz w:val="19"/>
+              </w:rPr>
+              <w:t>___</w:t>
+            </w:r>
+          </w:p>
+        </w:tc>
+        <w:tc>
+          <w:tcPr>
+            <w:tcW w:type="dxa" w:w="1620"/>
+            <w:tcBorders>
+              <w:top w:val="single" w:sz="4" w:space="0" w:color="BFBFBF"/>
+              <w:left w:val="single" w:sz="4" w:space="0" w:color="BFBFBF"/>
+              <w:bottom w:val="single" w:sz="4" w:space="0" w:color="BFBFBF"/>
+              <w:right w:val="single" w:sz="4" w:space="0" w:color="BFBFBF"/>
+            </w:tcBorders>
+          </w:tcPr>
+          <w:p>
+            <w:r/>
+            <w:r>
+              <w:rPr>
+                <w:sz w:val="19"/>
+              </w:rPr>
+              <w:t>___</w:t>
+            </w:r>
+          </w:p>
+        </w:tc>
+      </w:tr>
+      <w:tr>
+        <w:tc>
+          <w:tcPr>
+            <w:tcW w:type="dxa" w:w="1620"/>
+            <w:tcBorders>
+              <w:top w:val="single" w:sz="4" w:space="0" w:color="BFBFBF"/>
+              <w:left w:val="single" w:sz="4" w:space="0" w:color="BFBFBF"/>
+              <w:bottom w:val="single" w:sz="4" w:space="0" w:color="BFBFBF"/>
+              <w:right w:val="single" w:sz="4" w:space="0" w:color="BFBFBF"/>
+            </w:tcBorders>
+          </w:tcPr>
+          <w:p>
+            <w:r/>
+            <w:r>
+              <w:rPr>
+                <w:sz w:val="19"/>
+              </w:rPr>
+              <w:t>Precision @ top-20</w:t>
+            </w:r>
+          </w:p>
+        </w:tc>
+        <w:tc>
+          <w:tcPr>
+            <w:tcW w:type="dxa" w:w="1620"/>
+            <w:tcBorders>
+              <w:top w:val="single" w:sz="4" w:space="0" w:color="BFBFBF"/>
+              <w:left w:val="single" w:sz="4" w:space="0" w:color="BFBFBF"/>
+              <w:bottom w:val="single" w:sz="4" w:space="0" w:color="BFBFBF"/>
+              <w:right w:val="single" w:sz="4" w:space="0" w:color="BFBFBF"/>
+            </w:tcBorders>
+          </w:tcPr>
+          <w:p>
+            <w:r/>
+            <w:r>
+              <w:rPr>
+                <w:sz w:val="19"/>
+              </w:rPr>
+              <w:t>___</w:t>
+            </w:r>
+          </w:p>
+        </w:tc>
+        <w:tc>
+          <w:tcPr>
+            <w:tcW w:type="dxa" w:w="1620"/>
+            <w:tcBorders>
+              <w:top w:val="single" w:sz="4" w:space="0" w:color="BFBFBF"/>
+              <w:left w:val="single" w:sz="4" w:space="0" w:color="BFBFBF"/>
+              <w:bottom w:val="single" w:sz="4" w:space="0" w:color="BFBFBF"/>
+              <w:right w:val="single" w:sz="4" w:space="0" w:color="BFBFBF"/>
+            </w:tcBorders>
+          </w:tcPr>
+          <w:p>
+            <w:r/>
+            <w:r>
+              <w:rPr>
+                <w:sz w:val="19"/>
+              </w:rPr>
+              <w:t>___</w:t>
+            </w:r>
+          </w:p>
+        </w:tc>
+        <w:tc>
+          <w:tcPr>
+            <w:tcW w:type="dxa" w:w="1620"/>
+            <w:tcBorders>
+              <w:top w:val="single" w:sz="4" w:space="0" w:color="BFBFBF"/>
+              <w:left w:val="single" w:sz="4" w:space="0" w:color="BFBFBF"/>
+              <w:bottom w:val="single" w:sz="4" w:space="0" w:color="BFBFBF"/>
+              <w:right w:val="single" w:sz="4" w:space="0" w:color="BFBFBF"/>
+            </w:tcBorders>
+          </w:tcPr>
+          <w:p>
+            <w:r/>
+            <w:r>
+              <w:rPr>
+                <w:sz w:val="19"/>
+              </w:rPr>
+              <w:t>___</w:t>
+            </w:r>
+          </w:p>
+        </w:tc>
+        <w:tc>
+          <w:tcPr>
+            <w:tcW w:type="dxa" w:w="1620"/>
+            <w:tcBorders>
+              <w:top w:val="single" w:sz="4" w:space="0" w:color="BFBFBF"/>
+              <w:left w:val="single" w:sz="4" w:space="0" w:color="BFBFBF"/>
+              <w:bottom w:val="single" w:sz="4" w:space="0" w:color="BFBFBF"/>
+              <w:right w:val="single" w:sz="4" w:space="0" w:color="BFBFBF"/>
+            </w:tcBorders>
+          </w:tcPr>
+          <w:p>
+            <w:r/>
+            <w:r>
+              <w:rPr>
+                <w:sz w:val="19"/>
+              </w:rPr>
+              <w:t>___</w:t>
+            </w:r>
+          </w:p>
+        </w:tc>
+        <w:tc>
+          <w:tcPr>
+            <w:tcW w:type="dxa" w:w="1620"/>
+            <w:tcBorders>
+              <w:top w:val="single" w:sz="4" w:space="0" w:color="BFBFBF"/>
+              <w:left w:val="single" w:sz="4" w:space="0" w:color="BFBFBF"/>
+              <w:bottom w:val="single" w:sz="4" w:space="0" w:color="BFBFBF"/>
+              <w:right w:val="single" w:sz="4" w:space="0" w:color="BFBFBF"/>
+            </w:tcBorders>
+          </w:tcPr>
+          <w:p>
+            <w:r/>
+            <w:r>
+              <w:rPr>
+                <w:sz w:val="19"/>
+              </w:rPr>
+              <w:t>___</w:t>
+            </w:r>
+          </w:p>
+        </w:tc>
+      </w:tr>
+      <w:tr>
+        <w:tc>
+          <w:tcPr>
+            <w:tcW w:type="dxa" w:w="1620"/>
+            <w:tcBorders>
+              <w:top w:val="single" w:sz="4" w:space="0" w:color="BFBFBF"/>
+              <w:left w:val="single" w:sz="4" w:space="0" w:color="BFBFBF"/>
+              <w:bottom w:val="single" w:sz="4" w:space="0" w:color="BFBFBF"/>
+              <w:right w:val="single" w:sz="4" w:space="0" w:color="BFBFBF"/>
+            </w:tcBorders>
+          </w:tcPr>
+          <w:p>
+            <w:r/>
+            <w:r>
+              <w:rPr>
+                <w:sz w:val="19"/>
+              </w:rPr>
+              <w:t>AUC (top tercile vs rest)</w:t>
+            </w:r>
+          </w:p>
+        </w:tc>
+        <w:tc>
+          <w:tcPr>
+            <w:tcW w:type="dxa" w:w="1620"/>
+            <w:tcBorders>
+              <w:top w:val="single" w:sz="4" w:space="0" w:color="BFBFBF"/>
+              <w:left w:val="single" w:sz="4" w:space="0" w:color="BFBFBF"/>
+              <w:bottom w:val="single" w:sz="4" w:space="0" w:color="BFBFBF"/>
+              <w:right w:val="single" w:sz="4" w:space="0" w:color="BFBFBF"/>
+            </w:tcBorders>
+          </w:tcPr>
+          <w:p>
+            <w:r/>
+            <w:r>
+              <w:rPr>
+                <w:sz w:val="19"/>
+              </w:rPr>
+              <w:t>___</w:t>
+            </w:r>
+          </w:p>
+        </w:tc>
+        <w:tc>
+          <w:tcPr>
+            <w:tcW w:type="dxa" w:w="1620"/>
+            <w:tcBorders>
+              <w:top w:val="single" w:sz="4" w:space="0" w:color="BFBFBF"/>
+              <w:left w:val="single" w:sz="4" w:space="0" w:color="BFBFBF"/>
+              <w:bottom w:val="single" w:sz="4" w:space="0" w:color="BFBFBF"/>
+              <w:right w:val="single" w:sz="4" w:space="0" w:color="BFBFBF"/>
+            </w:tcBorders>
+          </w:tcPr>
+          <w:p>
+            <w:r/>
+            <w:r>
+              <w:rPr>
+                <w:sz w:val="19"/>
+              </w:rPr>
+              <w:t>___</w:t>
+            </w:r>
+          </w:p>
+        </w:tc>
+        <w:tc>
+          <w:tcPr>
+            <w:tcW w:type="dxa" w:w="1620"/>
+            <w:tcBorders>
+              <w:top w:val="single" w:sz="4" w:space="0" w:color="BFBFBF"/>
+              <w:left w:val="single" w:sz="4" w:space="0" w:color="BFBFBF"/>
+              <w:bottom w:val="single" w:sz="4" w:space="0" w:color="BFBFBF"/>
+              <w:right w:val="single" w:sz="4" w:space="0" w:color="BFBFBF"/>
+            </w:tcBorders>
+          </w:tcPr>
+          <w:p>
+            <w:r/>
+            <w:r>
+              <w:rPr>
+                <w:sz w:val="19"/>
+              </w:rPr>
+              <w:t>___</w:t>
+            </w:r>
+          </w:p>
+        </w:tc>
+        <w:tc>
+          <w:tcPr>
+            <w:tcW w:type="dxa" w:w="1620"/>
+            <w:tcBorders>
+              <w:top w:val="single" w:sz="4" w:space="0" w:color="BFBFBF"/>
+              <w:left w:val="single" w:sz="4" w:space="0" w:color="BFBFBF"/>
+              <w:bottom w:val="single" w:sz="4" w:space="0" w:color="BFBFBF"/>
+              <w:right w:val="single" w:sz="4" w:space="0" w:color="BFBFBF"/>
+            </w:tcBorders>
+          </w:tcPr>
+          <w:p>
+            <w:r/>
+            <w:r>
+              <w:rPr>
+                <w:sz w:val="19"/>
+              </w:rPr>
+              <w:t>___</w:t>
+            </w:r>
+          </w:p>
+        </w:tc>
+        <w:tc>
+          <w:tcPr>
+            <w:tcW w:type="dxa" w:w="1620"/>
+            <w:tcBorders>
+              <w:top w:val="single" w:sz="4" w:space="0" w:color="BFBFBF"/>
+              <w:left w:val="single" w:sz="4" w:space="0" w:color="BFBFBF"/>
+              <w:bottom w:val="single" w:sz="4" w:space="0" w:color="BFBFBF"/>
+              <w:right w:val="single" w:sz="4" w:space="0" w:color="BFBFBF"/>
+            </w:tcBorders>
+          </w:tcPr>
+          <w:p>
+            <w:r/>
+            <w:r>
+              <w:rPr>
+                <w:sz w:val="19"/>
+              </w:rPr>
+              <w:t>___</w:t>
+            </w:r>
+          </w:p>
+        </w:tc>
+      </w:tr>
+    </w:tbl>
+    <w:p>
+      <w:r>
+        <w:rPr>
+          <w:b/>
+          <w:sz w:val="22"/>
+        </w:rPr>
+        <w:t xml:space="preserve">Kill criterion. </w:t>
+      </w:r>
+      <w:r>
+        <w:rPr>
+          <w:sz w:val="22"/>
+        </w:rPr>
+        <w:t>If the lift is ≤ 0 or not statistically significant, the composite does not earn its complexity and the framing must be revised before the pitch — not defended on stage.</w:t>
+      </w:r>
+    </w:p>
+    <w:p>
+      <w:pPr>
+        <w:pStyle w:val="Heading2"/>
+      </w:pPr>
+      <w:r>
+        <w:t>III.2  Temporal Out-of-Time Validation  (public data)</w:t>
+      </w:r>
+    </w:p>
+    <w:p>
+      <w:r>
+        <w:rPr>
+          <w:b/>
+          <w:sz w:val="22"/>
+        </w:rPr>
+        <w:t xml:space="preserve">Design. </w:t>
+      </w:r>
+      <w:r>
+        <w:rPr>
+          <w:sz w:val="22"/>
+        </w:rPr>
+        <w:t>Build the composite from an earlier PLACES vintage only (2022 release, 2020 BRFSS), freeze it, then test how well that frozen ranking predicts the realized change in the diagnosis gap observed in the later PLACES vintage (2024/2025 release). This uses only data already ingested; no external resource is required.</w:t>
+      </w:r>
+    </w:p>
+    <w:p>
+      <w:r>
+        <w:rPr>
+          <w:b/>
+          <w:sz w:val="22"/>
+        </w:rPr>
+        <w:t xml:space="preserve">What it proves — and does not. </w:t>
+      </w:r>
+      <w:r>
+        <w:rPr>
+          <w:sz w:val="22"/>
+        </w:rPr>
+        <w:t>It shows the signal is temporally coherent and non-random: geographies flagged on old data track subsequent movement. It is explicitly not causal — absent a known intervention, this measures predictive structure, not program effect. State it exactly that way; do not overclaim.</w:t>
+      </w:r>
+    </w:p>
+    <w:tbl>
+      <w:tblPr>
+        <w:tblW w:type="auto" w:w="0"/>
+        <w:tblLook w:firstColumn="1" w:firstRow="1" w:lastColumn="0" w:lastRow="0" w:noHBand="0" w:noVBand="1" w:val="04A0"/>
+      </w:tblPr>
+      <w:tblGrid>
+        <w:gridCol w:w="1944"/>
+        <w:gridCol w:w="1944"/>
+        <w:gridCol w:w="1944"/>
+        <w:gridCol w:w="1944"/>
+        <w:gridCol w:w="1944"/>
+      </w:tblGrid>
+      <w:tr>
+        <w:tc>
+          <w:tcPr>
+            <w:tcW w:type="dxa" w:w="1944"/>
+            <w:tcBorders>
+              <w:top w:val="single" w:sz="4" w:space="0" w:color="BFBFBF"/>
+              <w:left w:val="single" w:sz="4" w:space="0" w:color="BFBFBF"/>
+              <w:bottom w:val="single" w:sz="4" w:space="0" w:color="BFBFBF"/>
+              <w:right w:val="single" w:sz="4" w:space="0" w:color="BFBFBF"/>
+            </w:tcBorders>
+          </w:tcPr>
+          <w:p>
+            <w:r/>
+            <w:r>
+              <w:rPr>
+                <w:b/>
+                <w:sz w:val="19"/>
+              </w:rPr>
+              <w:t>Score cohort</w:t>
+            </w:r>
+          </w:p>
+        </w:tc>
+        <w:tc>
+          <w:tcPr>
+            <w:tcW w:type="dxa" w:w="1944"/>
+            <w:tcBorders>
+              <w:top w:val="single" w:sz="4" w:space="0" w:color="BFBFBF"/>
+              <w:left w:val="single" w:sz="4" w:space="0" w:color="BFBFBF"/>
+              <w:bottom w:val="single" w:sz="4" w:space="0" w:color="BFBFBF"/>
+              <w:right w:val="single" w:sz="4" w:space="0" w:color="BFBFBF"/>
+            </w:tcBorders>
+          </w:tcPr>
+          <w:p>
+            <w:r/>
+            <w:r>
+              <w:rPr>
+                <w:b/>
+                <w:sz w:val="19"/>
+              </w:rPr>
+              <w:t>n counties</w:t>
+            </w:r>
+          </w:p>
+        </w:tc>
+        <w:tc>
+          <w:tcPr>
+            <w:tcW w:type="dxa" w:w="1944"/>
+            <w:tcBorders>
+              <w:top w:val="single" w:sz="4" w:space="0" w:color="BFBFBF"/>
+              <w:left w:val="single" w:sz="4" w:space="0" w:color="BFBFBF"/>
+              <w:bottom w:val="single" w:sz="4" w:space="0" w:color="BFBFBF"/>
+              <w:right w:val="single" w:sz="4" w:space="0" w:color="BFBFBF"/>
+            </w:tcBorders>
+          </w:tcPr>
+          <w:p>
+            <w:r/>
+            <w:r>
+              <w:rPr>
+                <w:b/>
+                <w:sz w:val="19"/>
+              </w:rPr>
+              <w:t>Mean realized Δ diagnosis gap</w:t>
+            </w:r>
+          </w:p>
+        </w:tc>
+        <w:tc>
+          <w:tcPr>
+            <w:tcW w:type="dxa" w:w="1944"/>
+            <w:tcBorders>
+              <w:top w:val="single" w:sz="4" w:space="0" w:color="BFBFBF"/>
+              <w:left w:val="single" w:sz="4" w:space="0" w:color="BFBFBF"/>
+              <w:bottom w:val="single" w:sz="4" w:space="0" w:color="BFBFBF"/>
+              <w:right w:val="single" w:sz="4" w:space="0" w:color="BFBFBF"/>
+            </w:tcBorders>
+          </w:tcPr>
+          <w:p>
+            <w:r/>
+            <w:r>
+              <w:rPr>
+                <w:b/>
+                <w:sz w:val="19"/>
+              </w:rPr>
+              <w:t>Baseline cohort Δ</w:t>
+            </w:r>
+          </w:p>
+        </w:tc>
+        <w:tc>
+          <w:tcPr>
+            <w:tcW w:type="dxa" w:w="1944"/>
+            <w:tcBorders>
+              <w:top w:val="single" w:sz="4" w:space="0" w:color="BFBFBF"/>
+              <w:left w:val="single" w:sz="4" w:space="0" w:color="BFBFBF"/>
+              <w:bottom w:val="single" w:sz="4" w:space="0" w:color="BFBFBF"/>
+              <w:right w:val="single" w:sz="4" w:space="0" w:color="BFBFBF"/>
+            </w:tcBorders>
+          </w:tcPr>
+          <w:p>
+            <w:r/>
+            <w:r>
+              <w:rPr>
+                <w:b/>
+                <w:sz w:val="19"/>
+              </w:rPr>
+              <w:t>Spearman ρ (rank vs realized)</w:t>
+            </w:r>
+          </w:p>
+        </w:tc>
+      </w:tr>
+      <w:tr>
+        <w:tc>
+          <w:tcPr>
+            <w:tcW w:type="dxa" w:w="1944"/>
+            <w:tcBorders>
+              <w:top w:val="single" w:sz="4" w:space="0" w:color="BFBFBF"/>
+              <w:left w:val="single" w:sz="4" w:space="0" w:color="BFBFBF"/>
+              <w:bottom w:val="single" w:sz="4" w:space="0" w:color="BFBFBF"/>
+              <w:right w:val="single" w:sz="4" w:space="0" w:color="BFBFBF"/>
+            </w:tcBorders>
+          </w:tcPr>
+          <w:p>
+            <w:r/>
+            <w:r>
+              <w:rPr>
+                <w:sz w:val="19"/>
+              </w:rPr>
+              <w:t>Priority tier / top decile</w:t>
+            </w:r>
+          </w:p>
+        </w:tc>
+        <w:tc>
+          <w:tcPr>
+            <w:tcW w:type="dxa" w:w="1944"/>
+            <w:tcBorders>
+              <w:top w:val="single" w:sz="4" w:space="0" w:color="BFBFBF"/>
+              <w:left w:val="single" w:sz="4" w:space="0" w:color="BFBFBF"/>
+              <w:bottom w:val="single" w:sz="4" w:space="0" w:color="BFBFBF"/>
+              <w:right w:val="single" w:sz="4" w:space="0" w:color="BFBFBF"/>
+            </w:tcBorders>
+          </w:tcPr>
+          <w:p>
+            <w:r/>
+            <w:r>
+              <w:rPr>
+                <w:sz w:val="19"/>
+              </w:rPr>
+              <w:t>___</w:t>
+            </w:r>
+          </w:p>
+        </w:tc>
+        <w:tc>
+          <w:tcPr>
+            <w:tcW w:type="dxa" w:w="1944"/>
+            <w:tcBorders>
+              <w:top w:val="single" w:sz="4" w:space="0" w:color="BFBFBF"/>
+              <w:left w:val="single" w:sz="4" w:space="0" w:color="BFBFBF"/>
+              <w:bottom w:val="single" w:sz="4" w:space="0" w:color="BFBFBF"/>
+              <w:right w:val="single" w:sz="4" w:space="0" w:color="BFBFBF"/>
+            </w:tcBorders>
+          </w:tcPr>
+          <w:p>
+            <w:r/>
+            <w:r>
+              <w:rPr>
+                <w:sz w:val="19"/>
+              </w:rPr>
+              <w:t>___</w:t>
+            </w:r>
+          </w:p>
+        </w:tc>
+        <w:tc>
+          <w:tcPr>
+            <w:tcW w:type="dxa" w:w="1944"/>
+            <w:tcBorders>
+              <w:top w:val="single" w:sz="4" w:space="0" w:color="BFBFBF"/>
+              <w:left w:val="single" w:sz="4" w:space="0" w:color="BFBFBF"/>
+              <w:bottom w:val="single" w:sz="4" w:space="0" w:color="BFBFBF"/>
+              <w:right w:val="single" w:sz="4" w:space="0" w:color="BFBFBF"/>
+            </w:tcBorders>
+          </w:tcPr>
+          <w:p>
+            <w:r/>
+            <w:r>
+              <w:rPr>
+                <w:sz w:val="19"/>
+              </w:rPr>
+              <w:t>___</w:t>
+            </w:r>
+          </w:p>
+        </w:tc>
+        <w:tc>
+          <w:tcPr>
+            <w:tcW w:type="dxa" w:w="1944"/>
+            <w:tcBorders>
+              <w:top w:val="single" w:sz="4" w:space="0" w:color="BFBFBF"/>
+              <w:left w:val="single" w:sz="4" w:space="0" w:color="BFBFBF"/>
+              <w:bottom w:val="single" w:sz="4" w:space="0" w:color="BFBFBF"/>
+              <w:right w:val="single" w:sz="4" w:space="0" w:color="BFBFBF"/>
+            </w:tcBorders>
+          </w:tcPr>
+          <w:p>
+            <w:r/>
+            <w:r>
+              <w:rPr>
+                <w:sz w:val="19"/>
+              </w:rPr>
+              <w:t>___</w:t>
+            </w:r>
+          </w:p>
+        </w:tc>
+      </w:tr>
+      <w:tr>
+        <w:tc>
+          <w:tcPr>
+            <w:tcW w:type="dxa" w:w="1944"/>
+            <w:tcBorders>
+              <w:top w:val="single" w:sz="4" w:space="0" w:color="BFBFBF"/>
+              <w:left w:val="single" w:sz="4" w:space="0" w:color="BFBFBF"/>
+              <w:bottom w:val="single" w:sz="4" w:space="0" w:color="BFBFBF"/>
+              <w:right w:val="single" w:sz="4" w:space="0" w:color="BFBFBF"/>
+            </w:tcBorders>
+          </w:tcPr>
+          <w:p>
+            <w:r/>
+            <w:r>
+              <w:rPr>
+                <w:sz w:val="19"/>
+              </w:rPr>
+              <w:t>Middle tier</w:t>
+            </w:r>
+          </w:p>
+        </w:tc>
+        <w:tc>
+          <w:tcPr>
+            <w:tcW w:type="dxa" w:w="1944"/>
+            <w:tcBorders>
+              <w:top w:val="single" w:sz="4" w:space="0" w:color="BFBFBF"/>
+              <w:left w:val="single" w:sz="4" w:space="0" w:color="BFBFBF"/>
+              <w:bottom w:val="single" w:sz="4" w:space="0" w:color="BFBFBF"/>
+              <w:right w:val="single" w:sz="4" w:space="0" w:color="BFBFBF"/>
+            </w:tcBorders>
+          </w:tcPr>
+          <w:p>
+            <w:r/>
+            <w:r>
+              <w:rPr>
+                <w:sz w:val="19"/>
+              </w:rPr>
+              <w:t>___</w:t>
+            </w:r>
+          </w:p>
+        </w:tc>
+        <w:tc>
+          <w:tcPr>
+            <w:tcW w:type="dxa" w:w="1944"/>
+            <w:tcBorders>
+              <w:top w:val="single" w:sz="4" w:space="0" w:color="BFBFBF"/>
+              <w:left w:val="single" w:sz="4" w:space="0" w:color="BFBFBF"/>
+              <w:bottom w:val="single" w:sz="4" w:space="0" w:color="BFBFBF"/>
+              <w:right w:val="single" w:sz="4" w:space="0" w:color="BFBFBF"/>
+            </w:tcBorders>
+          </w:tcPr>
+          <w:p>
+            <w:r/>
+            <w:r>
+              <w:rPr>
+                <w:sz w:val="19"/>
+              </w:rPr>
+              <w:t>___</w:t>
+            </w:r>
+          </w:p>
+        </w:tc>
+        <w:tc>
+          <w:tcPr>
+            <w:tcW w:type="dxa" w:w="1944"/>
+            <w:tcBorders>
+              <w:top w:val="single" w:sz="4" w:space="0" w:color="BFBFBF"/>
+              <w:left w:val="single" w:sz="4" w:space="0" w:color="BFBFBF"/>
+              <w:bottom w:val="single" w:sz="4" w:space="0" w:color="BFBFBF"/>
+              <w:right w:val="single" w:sz="4" w:space="0" w:color="BFBFBF"/>
+            </w:tcBorders>
+          </w:tcPr>
+          <w:p>
+            <w:r/>
+            <w:r>
+              <w:rPr>
+                <w:sz w:val="19"/>
+              </w:rPr>
+              <w:t>___</w:t>
+            </w:r>
+          </w:p>
+        </w:tc>
+        <w:tc>
+          <w:tcPr>
+            <w:tcW w:type="dxa" w:w="1944"/>
+            <w:tcBorders>
+              <w:top w:val="single" w:sz="4" w:space="0" w:color="BFBFBF"/>
+              <w:left w:val="single" w:sz="4" w:space="0" w:color="BFBFBF"/>
+              <w:bottom w:val="single" w:sz="4" w:space="0" w:color="BFBFBF"/>
+              <w:right w:val="single" w:sz="4" w:space="0" w:color="BFBFBF"/>
+            </w:tcBorders>
+          </w:tcPr>
+          <w:p>
+            <w:r/>
+            <w:r>
+              <w:rPr>
+                <w:sz w:val="19"/>
+              </w:rPr>
+              <w:t>___</w:t>
+            </w:r>
+          </w:p>
+        </w:tc>
+      </w:tr>
+      <w:tr>
+        <w:tc>
+          <w:tcPr>
+            <w:tcW w:type="dxa" w:w="1944"/>
+            <w:tcBorders>
+              <w:top w:val="single" w:sz="4" w:space="0" w:color="BFBFBF"/>
+              <w:left w:val="single" w:sz="4" w:space="0" w:color="BFBFBF"/>
+              <w:bottom w:val="single" w:sz="4" w:space="0" w:color="BFBFBF"/>
+              <w:right w:val="single" w:sz="4" w:space="0" w:color="BFBFBF"/>
+            </w:tcBorders>
+          </w:tcPr>
+          <w:p>
+            <w:r/>
+            <w:r>
+              <w:rPr>
+                <w:sz w:val="19"/>
+              </w:rPr>
+              <w:t>Bottom decile</w:t>
+            </w:r>
+          </w:p>
+        </w:tc>
+        <w:tc>
+          <w:tcPr>
+            <w:tcW w:type="dxa" w:w="1944"/>
+            <w:tcBorders>
+              <w:top w:val="single" w:sz="4" w:space="0" w:color="BFBFBF"/>
+              <w:left w:val="single" w:sz="4" w:space="0" w:color="BFBFBF"/>
+              <w:bottom w:val="single" w:sz="4" w:space="0" w:color="BFBFBF"/>
+              <w:right w:val="single" w:sz="4" w:space="0" w:color="BFBFBF"/>
+            </w:tcBorders>
+          </w:tcPr>
+          <w:p>
+            <w:r/>
+            <w:r>
+              <w:rPr>
+                <w:sz w:val="19"/>
+              </w:rPr>
+              <w:t>___</w:t>
+            </w:r>
+          </w:p>
+        </w:tc>
+        <w:tc>
+          <w:tcPr>
+            <w:tcW w:type="dxa" w:w="1944"/>
+            <w:tcBorders>
+              <w:top w:val="single" w:sz="4" w:space="0" w:color="BFBFBF"/>
+              <w:left w:val="single" w:sz="4" w:space="0" w:color="BFBFBF"/>
+              <w:bottom w:val="single" w:sz="4" w:space="0" w:color="BFBFBF"/>
+              <w:right w:val="single" w:sz="4" w:space="0" w:color="BFBFBF"/>
+            </w:tcBorders>
+          </w:tcPr>
+          <w:p>
+            <w:r/>
+            <w:r>
+              <w:rPr>
+                <w:sz w:val="19"/>
+              </w:rPr>
+              <w:t>___</w:t>
+            </w:r>
+          </w:p>
+        </w:tc>
+        <w:tc>
+          <w:tcPr>
+            <w:tcW w:type="dxa" w:w="1944"/>
+            <w:tcBorders>
+              <w:top w:val="single" w:sz="4" w:space="0" w:color="BFBFBF"/>
+              <w:left w:val="single" w:sz="4" w:space="0" w:color="BFBFBF"/>
+              <w:bottom w:val="single" w:sz="4" w:space="0" w:color="BFBFBF"/>
+              <w:right w:val="single" w:sz="4" w:space="0" w:color="BFBFBF"/>
+            </w:tcBorders>
+          </w:tcPr>
+          <w:p>
+            <w:r/>
+            <w:r>
+              <w:rPr>
+                <w:sz w:val="19"/>
+              </w:rPr>
+              <w:t>___</w:t>
+            </w:r>
+          </w:p>
+        </w:tc>
+        <w:tc>
+          <w:tcPr>
+            <w:tcW w:type="dxa" w:w="1944"/>
+            <w:tcBorders>
+              <w:top w:val="single" w:sz="4" w:space="0" w:color="BFBFBF"/>
+              <w:left w:val="single" w:sz="4" w:space="0" w:color="BFBFBF"/>
+              <w:bottom w:val="single" w:sz="4" w:space="0" w:color="BFBFBF"/>
+              <w:right w:val="single" w:sz="4" w:space="0" w:color="BFBFBF"/>
+            </w:tcBorders>
+          </w:tcPr>
+          <w:p>
+            <w:r/>
+            <w:r>
+              <w:rPr>
+                <w:sz w:val="19"/>
+              </w:rPr>
+              <w:t>___</w:t>
+            </w:r>
+          </w:p>
+        </w:tc>
+      </w:tr>
+    </w:tbl>
+    <w:p>
+      <w:pPr>
+        <w:pStyle w:val="Heading2"/>
+      </w:pPr>
+      <w:r>
+        <w:t>III.3  External Held-Out Source Validation  (public data)</w:t>
+      </w:r>
+    </w:p>
+    <w:p>
+      <w:r>
+        <w:rPr>
+          <w:b/>
+          <w:sz w:val="22"/>
+        </w:rPr>
+        <w:t xml:space="preserve">Design. </w:t>
+      </w:r>
+      <w:r>
+        <w:rPr>
+          <w:sz w:val="22"/>
+        </w:rPr>
+        <w:t>Hold out a public dataset the composite never ingests, and test whether the score predicts it. For a CKD flagship: USRDS regional CKD/ESRD prevalence. General fallback: County Health Rankings measures excluded from scoring. A model that predicts a source it never saw is a model — not a restatement of its own inputs.</w:t>
+      </w:r>
+    </w:p>
+    <w:tbl>
+      <w:tblPr>
+        <w:tblW w:type="auto" w:w="0"/>
+        <w:tblLook w:firstColumn="1" w:firstRow="1" w:lastColumn="0" w:lastRow="0" w:noHBand="0" w:noVBand="1" w:val="04A0"/>
+      </w:tblPr>
+      <w:tblGrid>
+        <w:gridCol w:w="1620"/>
+        <w:gridCol w:w="1620"/>
+        <w:gridCol w:w="1620"/>
+        <w:gridCol w:w="1620"/>
+        <w:gridCol w:w="1620"/>
+        <w:gridCol w:w="1620"/>
+      </w:tblGrid>
+      <w:tr>
+        <w:tc>
+          <w:tcPr>
+            <w:tcW w:type="dxa" w:w="1620"/>
+            <w:tcBorders>
+              <w:top w:val="single" w:sz="4" w:space="0" w:color="BFBFBF"/>
+              <w:left w:val="single" w:sz="4" w:space="0" w:color="BFBFBF"/>
+              <w:bottom w:val="single" w:sz="4" w:space="0" w:color="BFBFBF"/>
+              <w:right w:val="single" w:sz="4" w:space="0" w:color="BFBFBF"/>
+            </w:tcBorders>
+          </w:tcPr>
+          <w:p>
+            <w:r/>
+            <w:r>
+              <w:rPr>
+                <w:b/>
+                <w:sz w:val="19"/>
+              </w:rPr>
+              <w:t>Held-out source</w:t>
+            </w:r>
+          </w:p>
+        </w:tc>
+        <w:tc>
+          <w:tcPr>
+            <w:tcW w:type="dxa" w:w="1620"/>
+            <w:tcBorders>
+              <w:top w:val="single" w:sz="4" w:space="0" w:color="BFBFBF"/>
+              <w:left w:val="single" w:sz="4" w:space="0" w:color="BFBFBF"/>
+              <w:bottom w:val="single" w:sz="4" w:space="0" w:color="BFBFBF"/>
+              <w:right w:val="single" w:sz="4" w:space="0" w:color="BFBFBF"/>
+            </w:tcBorders>
+          </w:tcPr>
+          <w:p>
+            <w:r/>
+            <w:r>
+              <w:rPr>
+                <w:b/>
+                <w:sz w:val="19"/>
+              </w:rPr>
+              <w:t>Geo level</w:t>
+            </w:r>
+          </w:p>
+        </w:tc>
+        <w:tc>
+          <w:tcPr>
+            <w:tcW w:type="dxa" w:w="1620"/>
+            <w:tcBorders>
+              <w:top w:val="single" w:sz="4" w:space="0" w:color="BFBFBF"/>
+              <w:left w:val="single" w:sz="4" w:space="0" w:color="BFBFBF"/>
+              <w:bottom w:val="single" w:sz="4" w:space="0" w:color="BFBFBF"/>
+              <w:right w:val="single" w:sz="4" w:space="0" w:color="BFBFBF"/>
+            </w:tcBorders>
+          </w:tcPr>
+          <w:p>
+            <w:r/>
+            <w:r>
+              <w:rPr>
+                <w:b/>
+                <w:sz w:val="19"/>
+              </w:rPr>
+              <w:t>n</w:t>
+            </w:r>
+          </w:p>
+        </w:tc>
+        <w:tc>
+          <w:tcPr>
+            <w:tcW w:type="dxa" w:w="1620"/>
+            <w:tcBorders>
+              <w:top w:val="single" w:sz="4" w:space="0" w:color="BFBFBF"/>
+              <w:left w:val="single" w:sz="4" w:space="0" w:color="BFBFBF"/>
+              <w:bottom w:val="single" w:sz="4" w:space="0" w:color="BFBFBF"/>
+              <w:right w:val="single" w:sz="4" w:space="0" w:color="BFBFBF"/>
+            </w:tcBorders>
+          </w:tcPr>
+          <w:p>
+            <w:r/>
+            <w:r>
+              <w:rPr>
+                <w:b/>
+                <w:sz w:val="19"/>
+              </w:rPr>
+              <w:t>Spearman ρ (SPPF vs held-out)</w:t>
+            </w:r>
+          </w:p>
+        </w:tc>
+        <w:tc>
+          <w:tcPr>
+            <w:tcW w:type="dxa" w:w="1620"/>
+            <w:tcBorders>
+              <w:top w:val="single" w:sz="4" w:space="0" w:color="BFBFBF"/>
+              <w:left w:val="single" w:sz="4" w:space="0" w:color="BFBFBF"/>
+              <w:bottom w:val="single" w:sz="4" w:space="0" w:color="BFBFBF"/>
+              <w:right w:val="single" w:sz="4" w:space="0" w:color="BFBFBF"/>
+            </w:tcBorders>
+          </w:tcPr>
+          <w:p>
+            <w:r/>
+            <w:r>
+              <w:rPr>
+                <w:b/>
+                <w:sz w:val="19"/>
+              </w:rPr>
+              <w:t>Baseline ρ</w:t>
+            </w:r>
+          </w:p>
+        </w:tc>
+        <w:tc>
+          <w:tcPr>
+            <w:tcW w:type="dxa" w:w="1620"/>
+            <w:tcBorders>
+              <w:top w:val="single" w:sz="4" w:space="0" w:color="BFBFBF"/>
+              <w:left w:val="single" w:sz="4" w:space="0" w:color="BFBFBF"/>
+              <w:bottom w:val="single" w:sz="4" w:space="0" w:color="BFBFBF"/>
+              <w:right w:val="single" w:sz="4" w:space="0" w:color="BFBFBF"/>
+            </w:tcBorders>
+          </w:tcPr>
+          <w:p>
+            <w:r/>
+            <w:r>
+              <w:rPr>
+                <w:b/>
+                <w:sz w:val="19"/>
+              </w:rPr>
+              <w:t>Lift (Δ)</w:t>
+            </w:r>
+          </w:p>
+        </w:tc>
+      </w:tr>
+      <w:tr>
+        <w:tc>
+          <w:tcPr>
+            <w:tcW w:type="dxa" w:w="1620"/>
+            <w:tcBorders>
+              <w:top w:val="single" w:sz="4" w:space="0" w:color="BFBFBF"/>
+              <w:left w:val="single" w:sz="4" w:space="0" w:color="BFBFBF"/>
+              <w:bottom w:val="single" w:sz="4" w:space="0" w:color="BFBFBF"/>
+              <w:right w:val="single" w:sz="4" w:space="0" w:color="BFBFBF"/>
+            </w:tcBorders>
+          </w:tcPr>
+          <w:p>
+            <w:r/>
+            <w:r>
+              <w:rPr>
+                <w:sz w:val="19"/>
+              </w:rPr>
+              <w:t>USRDS CKD/ESRD prevalence</w:t>
+            </w:r>
+          </w:p>
+        </w:tc>
+        <w:tc>
+          <w:tcPr>
+            <w:tcW w:type="dxa" w:w="1620"/>
+            <w:tcBorders>
+              <w:top w:val="single" w:sz="4" w:space="0" w:color="BFBFBF"/>
+              <w:left w:val="single" w:sz="4" w:space="0" w:color="BFBFBF"/>
+              <w:bottom w:val="single" w:sz="4" w:space="0" w:color="BFBFBF"/>
+              <w:right w:val="single" w:sz="4" w:space="0" w:color="BFBFBF"/>
+            </w:tcBorders>
+          </w:tcPr>
+          <w:p>
+            <w:r/>
+            <w:r>
+              <w:rPr>
+                <w:sz w:val="19"/>
+              </w:rPr>
+              <w:t>___</w:t>
+            </w:r>
+          </w:p>
+        </w:tc>
+        <w:tc>
+          <w:tcPr>
+            <w:tcW w:type="dxa" w:w="1620"/>
+            <w:tcBorders>
+              <w:top w:val="single" w:sz="4" w:space="0" w:color="BFBFBF"/>
+              <w:left w:val="single" w:sz="4" w:space="0" w:color="BFBFBF"/>
+              <w:bottom w:val="single" w:sz="4" w:space="0" w:color="BFBFBF"/>
+              <w:right w:val="single" w:sz="4" w:space="0" w:color="BFBFBF"/>
+            </w:tcBorders>
+          </w:tcPr>
+          <w:p>
+            <w:r/>
+            <w:r>
+              <w:rPr>
+                <w:sz w:val="19"/>
+              </w:rPr>
+              <w:t>___</w:t>
+            </w:r>
+          </w:p>
+        </w:tc>
+        <w:tc>
+          <w:tcPr>
+            <w:tcW w:type="dxa" w:w="1620"/>
+            <w:tcBorders>
+              <w:top w:val="single" w:sz="4" w:space="0" w:color="BFBFBF"/>
+              <w:left w:val="single" w:sz="4" w:space="0" w:color="BFBFBF"/>
+              <w:bottom w:val="single" w:sz="4" w:space="0" w:color="BFBFBF"/>
+              <w:right w:val="single" w:sz="4" w:space="0" w:color="BFBFBF"/>
+            </w:tcBorders>
+          </w:tcPr>
+          <w:p>
+            <w:r/>
+            <w:r>
+              <w:rPr>
+                <w:sz w:val="19"/>
+              </w:rPr>
+              <w:t>___</w:t>
+            </w:r>
+          </w:p>
+        </w:tc>
+        <w:tc>
+          <w:tcPr>
+            <w:tcW w:type="dxa" w:w="1620"/>
+            <w:tcBorders>
+              <w:top w:val="single" w:sz="4" w:space="0" w:color="BFBFBF"/>
+              <w:left w:val="single" w:sz="4" w:space="0" w:color="BFBFBF"/>
+              <w:bottom w:val="single" w:sz="4" w:space="0" w:color="BFBFBF"/>
+              <w:right w:val="single" w:sz="4" w:space="0" w:color="BFBFBF"/>
+            </w:tcBorders>
+          </w:tcPr>
+          <w:p>
+            <w:r/>
+            <w:r>
+              <w:rPr>
+                <w:sz w:val="19"/>
+              </w:rPr>
+              <w:t>___</w:t>
+            </w:r>
+          </w:p>
+        </w:tc>
+        <w:tc>
+          <w:tcPr>
+            <w:tcW w:type="dxa" w:w="1620"/>
+            <w:tcBorders>
+              <w:top w:val="single" w:sz="4" w:space="0" w:color="BFBFBF"/>
+              <w:left w:val="single" w:sz="4" w:space="0" w:color="BFBFBF"/>
+              <w:bottom w:val="single" w:sz="4" w:space="0" w:color="BFBFBF"/>
+              <w:right w:val="single" w:sz="4" w:space="0" w:color="BFBFBF"/>
+            </w:tcBorders>
+          </w:tcPr>
+          <w:p>
+            <w:r/>
+            <w:r>
+              <w:rPr>
+                <w:sz w:val="19"/>
+              </w:rPr>
+              <w:t>___</w:t>
+            </w:r>
+          </w:p>
+        </w:tc>
+      </w:tr>
+      <w:tr>
+        <w:tc>
+          <w:tcPr>
+            <w:tcW w:type="dxa" w:w="1620"/>
+            <w:tcBorders>
+              <w:top w:val="single" w:sz="4" w:space="0" w:color="BFBFBF"/>
+              <w:left w:val="single" w:sz="4" w:space="0" w:color="BFBFBF"/>
+              <w:bottom w:val="single" w:sz="4" w:space="0" w:color="BFBFBF"/>
+              <w:right w:val="single" w:sz="4" w:space="0" w:color="BFBFBF"/>
+            </w:tcBorders>
+          </w:tcPr>
+          <w:p>
+            <w:r/>
+            <w:r>
+              <w:rPr>
+                <w:sz w:val="19"/>
+              </w:rPr>
+              <w:t>CHR held-out measure</w:t>
+            </w:r>
+          </w:p>
+        </w:tc>
+        <w:tc>
+          <w:tcPr>
+            <w:tcW w:type="dxa" w:w="1620"/>
+            <w:tcBorders>
+              <w:top w:val="single" w:sz="4" w:space="0" w:color="BFBFBF"/>
+              <w:left w:val="single" w:sz="4" w:space="0" w:color="BFBFBF"/>
+              <w:bottom w:val="single" w:sz="4" w:space="0" w:color="BFBFBF"/>
+              <w:right w:val="single" w:sz="4" w:space="0" w:color="BFBFBF"/>
+            </w:tcBorders>
+          </w:tcPr>
+          <w:p>
+            <w:r/>
+            <w:r>
+              <w:rPr>
+                <w:sz w:val="19"/>
+              </w:rPr>
+              <w:t>___</w:t>
+            </w:r>
+          </w:p>
+        </w:tc>
+        <w:tc>
+          <w:tcPr>
+            <w:tcW w:type="dxa" w:w="1620"/>
+            <w:tcBorders>
+              <w:top w:val="single" w:sz="4" w:space="0" w:color="BFBFBF"/>
+              <w:left w:val="single" w:sz="4" w:space="0" w:color="BFBFBF"/>
+              <w:bottom w:val="single" w:sz="4" w:space="0" w:color="BFBFBF"/>
+              <w:right w:val="single" w:sz="4" w:space="0" w:color="BFBFBF"/>
+            </w:tcBorders>
+          </w:tcPr>
+          <w:p>
+            <w:r/>
+            <w:r>
+              <w:rPr>
+                <w:sz w:val="19"/>
+              </w:rPr>
+              <w:t>___</w:t>
+            </w:r>
+          </w:p>
+        </w:tc>
+        <w:tc>
+          <w:tcPr>
+            <w:tcW w:type="dxa" w:w="1620"/>
+            <w:tcBorders>
+              <w:top w:val="single" w:sz="4" w:space="0" w:color="BFBFBF"/>
+              <w:left w:val="single" w:sz="4" w:space="0" w:color="BFBFBF"/>
+              <w:bottom w:val="single" w:sz="4" w:space="0" w:color="BFBFBF"/>
+              <w:right w:val="single" w:sz="4" w:space="0" w:color="BFBFBF"/>
+            </w:tcBorders>
+          </w:tcPr>
+          <w:p>
+            <w:r/>
+            <w:r>
+              <w:rPr>
+                <w:sz w:val="19"/>
+              </w:rPr>
+              <w:t>___</w:t>
+            </w:r>
+          </w:p>
+        </w:tc>
+        <w:tc>
+          <w:tcPr>
+            <w:tcW w:type="dxa" w:w="1620"/>
+            <w:tcBorders>
+              <w:top w:val="single" w:sz="4" w:space="0" w:color="BFBFBF"/>
+              <w:left w:val="single" w:sz="4" w:space="0" w:color="BFBFBF"/>
+              <w:bottom w:val="single" w:sz="4" w:space="0" w:color="BFBFBF"/>
+              <w:right w:val="single" w:sz="4" w:space="0" w:color="BFBFBF"/>
+            </w:tcBorders>
+          </w:tcPr>
+          <w:p>
+            <w:r/>
+            <w:r>
+              <w:rPr>
+                <w:sz w:val="19"/>
+              </w:rPr>
+              <w:t>___</w:t>
+            </w:r>
+          </w:p>
+        </w:tc>
+        <w:tc>
+          <w:tcPr>
+            <w:tcW w:type="dxa" w:w="1620"/>
+            <w:tcBorders>
+              <w:top w:val="single" w:sz="4" w:space="0" w:color="BFBFBF"/>
+              <w:left w:val="single" w:sz="4" w:space="0" w:color="BFBFBF"/>
+              <w:bottom w:val="single" w:sz="4" w:space="0" w:color="BFBFBF"/>
+              <w:right w:val="single" w:sz="4" w:space="0" w:color="BFBFBF"/>
+            </w:tcBorders>
+          </w:tcPr>
+          <w:p>
+            <w:r/>
+            <w:r>
+              <w:rPr>
+                <w:sz w:val="19"/>
+              </w:rPr>
+              <w:t>___</w:t>
+            </w:r>
+          </w:p>
+        </w:tc>
+      </w:tr>
+    </w:tbl>
+    <w:p>
+      <w:r>
+        <w:rPr>
+          <w:b/>
+          <w:sz w:val="22"/>
+        </w:rPr>
+        <w:t xml:space="preserve">Leakage control. </w:t>
+      </w:r>
+      <w:r>
+        <w:rPr>
+          <w:sz w:val="22"/>
+        </w:rPr>
+        <w:t>Choose the held-out source from outside the seven scoring inputs and document exactly which fields were excluded, so no reviewer can claim the target leaked into the model.</w:t>
+      </w:r>
+    </w:p>
+    <w:p>
+      <w:pPr>
+        <w:pStyle w:val="Heading2"/>
+      </w:pPr>
+      <w:r>
+        <w:t>III.4  Incremental Value Over Social Determinants  (public data)</w:t>
+      </w:r>
+    </w:p>
+    <w:p>
+      <w:r>
+        <w:rPr>
+          <w:b/>
+          <w:sz w:val="22"/>
+        </w:rPr>
+        <w:t xml:space="preserve">The objection. </w:t>
+      </w:r>
+      <w:r>
+        <w:rPr>
+          <w:sz w:val="22"/>
+        </w:rPr>
+        <w:t>High opportunity correlates with rural, low-income, high-SDoH geographies. A reviewer will ask whether the composite is a deprivation index in disguise — "are we just rediscovering poverty?"</w:t>
+      </w:r>
+    </w:p>
+    <w:p>
+      <w:r>
+        <w:rPr>
+          <w:b/>
+          <w:sz w:val="22"/>
+        </w:rPr>
+        <w:t xml:space="preserve">The test. </w:t>
+      </w:r>
+      <w:r>
+        <w:rPr>
+          <w:sz w:val="22"/>
+        </w:rPr>
+        <w:t>Fit an SDoH-only baseline (Social Determinants plus Access dimensions), then measure the incremental predictive value the Diagnosis Gap dimension adds on top: partial correlation of Diagnosis Gap with the outcome controlling for SDoH, and incremental R² (ΔR²) when Diagnosis Gap enters the SDoH-only model.</w:t>
+      </w:r>
+    </w:p>
+    <w:tbl>
+      <w:tblPr>
+        <w:tblW w:type="auto" w:w="0"/>
+        <w:tblLook w:firstColumn="1" w:firstRow="1" w:lastColumn="0" w:lastRow="0" w:noHBand="0" w:noVBand="1" w:val="04A0"/>
+      </w:tblPr>
+      <w:tblGrid>
+        <w:gridCol w:w="1944"/>
+        <w:gridCol w:w="1944"/>
+        <w:gridCol w:w="1944"/>
+        <w:gridCol w:w="1944"/>
+        <w:gridCol w:w="1944"/>
+      </w:tblGrid>
+      <w:tr>
+        <w:tc>
+          <w:tcPr>
+            <w:tcW w:type="dxa" w:w="1944"/>
+            <w:tcBorders>
+              <w:top w:val="single" w:sz="4" w:space="0" w:color="BFBFBF"/>
+              <w:left w:val="single" w:sz="4" w:space="0" w:color="BFBFBF"/>
+              <w:bottom w:val="single" w:sz="4" w:space="0" w:color="BFBFBF"/>
+              <w:right w:val="single" w:sz="4" w:space="0" w:color="BFBFBF"/>
+            </w:tcBorders>
+          </w:tcPr>
+          <w:p>
+            <w:r/>
+            <w:r>
+              <w:rPr>
+                <w:b/>
+                <w:sz w:val="19"/>
+              </w:rPr>
+              <w:t>Model</w:t>
+            </w:r>
+          </w:p>
+        </w:tc>
+        <w:tc>
+          <w:tcPr>
+            <w:tcW w:type="dxa" w:w="1944"/>
+            <w:tcBorders>
+              <w:top w:val="single" w:sz="4" w:space="0" w:color="BFBFBF"/>
+              <w:left w:val="single" w:sz="4" w:space="0" w:color="BFBFBF"/>
+              <w:bottom w:val="single" w:sz="4" w:space="0" w:color="BFBFBF"/>
+              <w:right w:val="single" w:sz="4" w:space="0" w:color="BFBFBF"/>
+            </w:tcBorders>
+          </w:tcPr>
+          <w:p>
+            <w:r/>
+            <w:r>
+              <w:rPr>
+                <w:b/>
+                <w:sz w:val="19"/>
+              </w:rPr>
+              <w:t>R²</w:t>
+            </w:r>
+          </w:p>
+        </w:tc>
+        <w:tc>
+          <w:tcPr>
+            <w:tcW w:type="dxa" w:w="1944"/>
+            <w:tcBorders>
+              <w:top w:val="single" w:sz="4" w:space="0" w:color="BFBFBF"/>
+              <w:left w:val="single" w:sz="4" w:space="0" w:color="BFBFBF"/>
+              <w:bottom w:val="single" w:sz="4" w:space="0" w:color="BFBFBF"/>
+              <w:right w:val="single" w:sz="4" w:space="0" w:color="BFBFBF"/>
+            </w:tcBorders>
+          </w:tcPr>
+          <w:p>
+            <w:r/>
+            <w:r>
+              <w:rPr>
+                <w:b/>
+                <w:sz w:val="19"/>
+              </w:rPr>
+              <w:t>ΔR² vs SDoH-only</w:t>
+            </w:r>
+          </w:p>
+        </w:tc>
+        <w:tc>
+          <w:tcPr>
+            <w:tcW w:type="dxa" w:w="1944"/>
+            <w:tcBorders>
+              <w:top w:val="single" w:sz="4" w:space="0" w:color="BFBFBF"/>
+              <w:left w:val="single" w:sz="4" w:space="0" w:color="BFBFBF"/>
+              <w:bottom w:val="single" w:sz="4" w:space="0" w:color="BFBFBF"/>
+              <w:right w:val="single" w:sz="4" w:space="0" w:color="BFBFBF"/>
+            </w:tcBorders>
+          </w:tcPr>
+          <w:p>
+            <w:r/>
+            <w:r>
+              <w:rPr>
+                <w:b/>
+                <w:sz w:val="19"/>
+              </w:rPr>
+              <w:t>Partial corr (Dx Gap | SDoH)</w:t>
+            </w:r>
+          </w:p>
+        </w:tc>
+        <w:tc>
+          <w:tcPr>
+            <w:tcW w:type="dxa" w:w="1944"/>
+            <w:tcBorders>
+              <w:top w:val="single" w:sz="4" w:space="0" w:color="BFBFBF"/>
+              <w:left w:val="single" w:sz="4" w:space="0" w:color="BFBFBF"/>
+              <w:bottom w:val="single" w:sz="4" w:space="0" w:color="BFBFBF"/>
+              <w:right w:val="single" w:sz="4" w:space="0" w:color="BFBFBF"/>
+            </w:tcBorders>
+          </w:tcPr>
+          <w:p>
+            <w:r/>
+            <w:r>
+              <w:rPr>
+                <w:b/>
+                <w:sz w:val="19"/>
+              </w:rPr>
+              <w:t>p-value</w:t>
+            </w:r>
+          </w:p>
+        </w:tc>
+      </w:tr>
+      <w:tr>
+        <w:tc>
+          <w:tcPr>
+            <w:tcW w:type="dxa" w:w="1944"/>
+            <w:tcBorders>
+              <w:top w:val="single" w:sz="4" w:space="0" w:color="BFBFBF"/>
+              <w:left w:val="single" w:sz="4" w:space="0" w:color="BFBFBF"/>
+              <w:bottom w:val="single" w:sz="4" w:space="0" w:color="BFBFBF"/>
+              <w:right w:val="single" w:sz="4" w:space="0" w:color="BFBFBF"/>
+            </w:tcBorders>
+          </w:tcPr>
+          <w:p>
+            <w:r/>
+            <w:r>
+              <w:rPr>
+                <w:sz w:val="19"/>
+              </w:rPr>
+              <w:t>SDoH-only baseline</w:t>
+            </w:r>
+          </w:p>
+        </w:tc>
+        <w:tc>
+          <w:tcPr>
+            <w:tcW w:type="dxa" w:w="1944"/>
+            <w:tcBorders>
+              <w:top w:val="single" w:sz="4" w:space="0" w:color="BFBFBF"/>
+              <w:left w:val="single" w:sz="4" w:space="0" w:color="BFBFBF"/>
+              <w:bottom w:val="single" w:sz="4" w:space="0" w:color="BFBFBF"/>
+              <w:right w:val="single" w:sz="4" w:space="0" w:color="BFBFBF"/>
+            </w:tcBorders>
+          </w:tcPr>
+          <w:p>
+            <w:r/>
+            <w:r>
+              <w:rPr>
+                <w:sz w:val="19"/>
+              </w:rPr>
+              <w:t>___</w:t>
+            </w:r>
+          </w:p>
+        </w:tc>
+        <w:tc>
+          <w:tcPr>
+            <w:tcW w:type="dxa" w:w="1944"/>
+            <w:tcBorders>
+              <w:top w:val="single" w:sz="4" w:space="0" w:color="BFBFBF"/>
+              <w:left w:val="single" w:sz="4" w:space="0" w:color="BFBFBF"/>
+              <w:bottom w:val="single" w:sz="4" w:space="0" w:color="BFBFBF"/>
+              <w:right w:val="single" w:sz="4" w:space="0" w:color="BFBFBF"/>
+            </w:tcBorders>
+          </w:tcPr>
+          <w:p>
+            <w:r/>
+            <w:r>
+              <w:rPr>
+                <w:sz w:val="19"/>
+              </w:rPr>
+              <w:t>—</w:t>
+            </w:r>
+          </w:p>
+        </w:tc>
+        <w:tc>
+          <w:tcPr>
+            <w:tcW w:type="dxa" w:w="1944"/>
+            <w:tcBorders>
+              <w:top w:val="single" w:sz="4" w:space="0" w:color="BFBFBF"/>
+              <w:left w:val="single" w:sz="4" w:space="0" w:color="BFBFBF"/>
+              <w:bottom w:val="single" w:sz="4" w:space="0" w:color="BFBFBF"/>
+              <w:right w:val="single" w:sz="4" w:space="0" w:color="BFBFBF"/>
+            </w:tcBorders>
+          </w:tcPr>
+          <w:p>
+            <w:r/>
+            <w:r>
+              <w:rPr>
+                <w:sz w:val="19"/>
+              </w:rPr>
+              <w:t>—</w:t>
+            </w:r>
+          </w:p>
+        </w:tc>
+        <w:tc>
+          <w:tcPr>
+            <w:tcW w:type="dxa" w:w="1944"/>
+            <w:tcBorders>
+              <w:top w:val="single" w:sz="4" w:space="0" w:color="BFBFBF"/>
+              <w:left w:val="single" w:sz="4" w:space="0" w:color="BFBFBF"/>
+              <w:bottom w:val="single" w:sz="4" w:space="0" w:color="BFBFBF"/>
+              <w:right w:val="single" w:sz="4" w:space="0" w:color="BFBFBF"/>
+            </w:tcBorders>
+          </w:tcPr>
+          <w:p>
+            <w:r/>
+            <w:r>
+              <w:rPr>
+                <w:sz w:val="19"/>
+              </w:rPr>
+              <w:t>—</w:t>
+            </w:r>
+          </w:p>
+        </w:tc>
+      </w:tr>
+      <w:tr>
+        <w:tc>
+          <w:tcPr>
+            <w:tcW w:type="dxa" w:w="1944"/>
+            <w:tcBorders>
+              <w:top w:val="single" w:sz="4" w:space="0" w:color="BFBFBF"/>
+              <w:left w:val="single" w:sz="4" w:space="0" w:color="BFBFBF"/>
+              <w:bottom w:val="single" w:sz="4" w:space="0" w:color="BFBFBF"/>
+              <w:right w:val="single" w:sz="4" w:space="0" w:color="BFBFBF"/>
+            </w:tcBorders>
+          </w:tcPr>
+          <w:p>
+            <w:r/>
+            <w:r>
+              <w:rPr>
+                <w:sz w:val="19"/>
+              </w:rPr>
+              <w:t>SDoH + Diagnosis Gap</w:t>
+            </w:r>
+          </w:p>
+        </w:tc>
+        <w:tc>
+          <w:tcPr>
+            <w:tcW w:type="dxa" w:w="1944"/>
+            <w:tcBorders>
+              <w:top w:val="single" w:sz="4" w:space="0" w:color="BFBFBF"/>
+              <w:left w:val="single" w:sz="4" w:space="0" w:color="BFBFBF"/>
+              <w:bottom w:val="single" w:sz="4" w:space="0" w:color="BFBFBF"/>
+              <w:right w:val="single" w:sz="4" w:space="0" w:color="BFBFBF"/>
+            </w:tcBorders>
+          </w:tcPr>
+          <w:p>
+            <w:r/>
+            <w:r>
+              <w:rPr>
+                <w:sz w:val="19"/>
+              </w:rPr>
+              <w:t>___</w:t>
+            </w:r>
+          </w:p>
+        </w:tc>
+        <w:tc>
+          <w:tcPr>
+            <w:tcW w:type="dxa" w:w="1944"/>
+            <w:tcBorders>
+              <w:top w:val="single" w:sz="4" w:space="0" w:color="BFBFBF"/>
+              <w:left w:val="single" w:sz="4" w:space="0" w:color="BFBFBF"/>
+              <w:bottom w:val="single" w:sz="4" w:space="0" w:color="BFBFBF"/>
+              <w:right w:val="single" w:sz="4" w:space="0" w:color="BFBFBF"/>
+            </w:tcBorders>
+          </w:tcPr>
+          <w:p>
+            <w:r/>
+            <w:r>
+              <w:rPr>
+                <w:sz w:val="19"/>
+              </w:rPr>
+              <w:t>___</w:t>
+            </w:r>
+          </w:p>
+        </w:tc>
+        <w:tc>
+          <w:tcPr>
+            <w:tcW w:type="dxa" w:w="1944"/>
+            <w:tcBorders>
+              <w:top w:val="single" w:sz="4" w:space="0" w:color="BFBFBF"/>
+              <w:left w:val="single" w:sz="4" w:space="0" w:color="BFBFBF"/>
+              <w:bottom w:val="single" w:sz="4" w:space="0" w:color="BFBFBF"/>
+              <w:right w:val="single" w:sz="4" w:space="0" w:color="BFBFBF"/>
+            </w:tcBorders>
+          </w:tcPr>
+          <w:p>
+            <w:r/>
+            <w:r>
+              <w:rPr>
+                <w:sz w:val="19"/>
+              </w:rPr>
+              <w:t>___</w:t>
+            </w:r>
+          </w:p>
+        </w:tc>
+        <w:tc>
+          <w:tcPr>
+            <w:tcW w:type="dxa" w:w="1944"/>
+            <w:tcBorders>
+              <w:top w:val="single" w:sz="4" w:space="0" w:color="BFBFBF"/>
+              <w:left w:val="single" w:sz="4" w:space="0" w:color="BFBFBF"/>
+              <w:bottom w:val="single" w:sz="4" w:space="0" w:color="BFBFBF"/>
+              <w:right w:val="single" w:sz="4" w:space="0" w:color="BFBFBF"/>
+            </w:tcBorders>
+          </w:tcPr>
+          <w:p>
+            <w:r/>
+            <w:r>
+              <w:rPr>
+                <w:sz w:val="19"/>
+              </w:rPr>
+              <w:t>___</w:t>
+            </w:r>
+          </w:p>
+        </w:tc>
+      </w:tr>
+      <w:tr>
+        <w:tc>
+          <w:tcPr>
+            <w:tcW w:type="dxa" w:w="1944"/>
+            <w:tcBorders>
+              <w:top w:val="single" w:sz="4" w:space="0" w:color="BFBFBF"/>
+              <w:left w:val="single" w:sz="4" w:space="0" w:color="BFBFBF"/>
+              <w:bottom w:val="single" w:sz="4" w:space="0" w:color="BFBFBF"/>
+              <w:right w:val="single" w:sz="4" w:space="0" w:color="BFBFBF"/>
+            </w:tcBorders>
+          </w:tcPr>
+          <w:p>
+            <w:r/>
+            <w:r>
+              <w:rPr>
+                <w:sz w:val="19"/>
+              </w:rPr>
+              <w:t>Full 7-dimension composite</w:t>
+            </w:r>
+          </w:p>
+        </w:tc>
+        <w:tc>
+          <w:tcPr>
+            <w:tcW w:type="dxa" w:w="1944"/>
+            <w:tcBorders>
+              <w:top w:val="single" w:sz="4" w:space="0" w:color="BFBFBF"/>
+              <w:left w:val="single" w:sz="4" w:space="0" w:color="BFBFBF"/>
+              <w:bottom w:val="single" w:sz="4" w:space="0" w:color="BFBFBF"/>
+              <w:right w:val="single" w:sz="4" w:space="0" w:color="BFBFBF"/>
+            </w:tcBorders>
+          </w:tcPr>
+          <w:p>
+            <w:r/>
+            <w:r>
+              <w:rPr>
+                <w:sz w:val="19"/>
+              </w:rPr>
+              <w:t>___</w:t>
+            </w:r>
+          </w:p>
+        </w:tc>
+        <w:tc>
+          <w:tcPr>
+            <w:tcW w:type="dxa" w:w="1944"/>
+            <w:tcBorders>
+              <w:top w:val="single" w:sz="4" w:space="0" w:color="BFBFBF"/>
+              <w:left w:val="single" w:sz="4" w:space="0" w:color="BFBFBF"/>
+              <w:bottom w:val="single" w:sz="4" w:space="0" w:color="BFBFBF"/>
+              <w:right w:val="single" w:sz="4" w:space="0" w:color="BFBFBF"/>
+            </w:tcBorders>
+          </w:tcPr>
+          <w:p>
+            <w:r/>
+            <w:r>
+              <w:rPr>
+                <w:sz w:val="19"/>
+              </w:rPr>
+              <w:t>___</w:t>
+            </w:r>
+          </w:p>
+        </w:tc>
+        <w:tc>
+          <w:tcPr>
+            <w:tcW w:type="dxa" w:w="1944"/>
+            <w:tcBorders>
+              <w:top w:val="single" w:sz="4" w:space="0" w:color="BFBFBF"/>
+              <w:left w:val="single" w:sz="4" w:space="0" w:color="BFBFBF"/>
+              <w:bottom w:val="single" w:sz="4" w:space="0" w:color="BFBFBF"/>
+              <w:right w:val="single" w:sz="4" w:space="0" w:color="BFBFBF"/>
+            </w:tcBorders>
+          </w:tcPr>
+          <w:p>
+            <w:r/>
+            <w:r>
+              <w:rPr>
+                <w:sz w:val="19"/>
+              </w:rPr>
+              <w:t>___</w:t>
+            </w:r>
+          </w:p>
+        </w:tc>
+        <w:tc>
+          <w:tcPr>
+            <w:tcW w:type="dxa" w:w="1944"/>
+            <w:tcBorders>
+              <w:top w:val="single" w:sz="4" w:space="0" w:color="BFBFBF"/>
+              <w:left w:val="single" w:sz="4" w:space="0" w:color="BFBFBF"/>
+              <w:bottom w:val="single" w:sz="4" w:space="0" w:color="BFBFBF"/>
+              <w:right w:val="single" w:sz="4" w:space="0" w:color="BFBFBF"/>
+            </w:tcBorders>
+          </w:tcPr>
+          <w:p>
+            <w:r/>
+            <w:r>
+              <w:rPr>
+                <w:sz w:val="19"/>
+              </w:rPr>
+              <w:t>___</w:t>
+            </w:r>
+          </w:p>
+        </w:tc>
+      </w:tr>
+    </w:tbl>
+    <w:p>
+      <w:r>
+        <w:rPr>
+          <w:b/>
+          <w:sz w:val="22"/>
+        </w:rPr>
+        <w:t xml:space="preserve">So what. </w:t>
+      </w:r>
+      <w:r>
+        <w:rPr>
+          <w:sz w:val="22"/>
+        </w:rPr>
+        <w:t>If ΔR² is near zero, the honest position is that SPPF is a well-built access map and the undiagnosed framing needs revisiting. If ΔR² is material, the diagnosis-gap signal carries independent information the SDoH data does not — this is the slide that wins the technical half of the room.</w:t>
+      </w:r>
+    </w:p>
+    <w:p>
+      <w:pPr>
+        <w:pStyle w:val="Heading2"/>
+      </w:pPr>
+      <w:r>
+        <w:t>III.5  Weight Stability — Quantified</w:t>
+      </w:r>
+    </w:p>
+    <w:p>
+      <w:r>
+        <w:rPr>
+          <w:b/>
+          <w:sz w:val="22"/>
+        </w:rPr>
+        <w:t xml:space="preserve">From panel to number. </w:t>
+      </w:r>
+      <w:r>
+        <w:rPr>
+          <w:sz w:val="22"/>
+        </w:rPr>
+        <w:t>Part II’s qualitative weight-sensitivity panel becomes a stated result. Perturb all seven weights by ±X% (Monte Carlo, N draws) and report how stable the decision is, not just that a slider exists.</w:t>
+      </w:r>
+    </w:p>
+    <w:tbl>
+      <w:tblPr>
+        <w:tblW w:type="auto" w:w="0"/>
+        <w:tblLook w:firstColumn="1" w:firstRow="1" w:lastColumn="0" w:lastRow="0" w:noHBand="0" w:noVBand="1" w:val="04A0"/>
+      </w:tblPr>
+      <w:tblGrid>
+        <w:gridCol w:w="1944"/>
+        <w:gridCol w:w="1944"/>
+        <w:gridCol w:w="1944"/>
+        <w:gridCol w:w="1944"/>
+        <w:gridCol w:w="1944"/>
+      </w:tblGrid>
+      <w:tr>
+        <w:tc>
+          <w:tcPr>
+            <w:tcW w:type="dxa" w:w="1944"/>
+            <w:tcBorders>
+              <w:top w:val="single" w:sz="4" w:space="0" w:color="BFBFBF"/>
+              <w:left w:val="single" w:sz="4" w:space="0" w:color="BFBFBF"/>
+              <w:bottom w:val="single" w:sz="4" w:space="0" w:color="BFBFBF"/>
+              <w:right w:val="single" w:sz="4" w:space="0" w:color="BFBFBF"/>
+            </w:tcBorders>
+          </w:tcPr>
+          <w:p>
+            <w:r/>
+            <w:r>
+              <w:rPr>
+                <w:b/>
+                <w:sz w:val="19"/>
+              </w:rPr>
+              <w:t>Perturbation</w:t>
+            </w:r>
+          </w:p>
+        </w:tc>
+        <w:tc>
+          <w:tcPr>
+            <w:tcW w:type="dxa" w:w="1944"/>
+            <w:tcBorders>
+              <w:top w:val="single" w:sz="4" w:space="0" w:color="BFBFBF"/>
+              <w:left w:val="single" w:sz="4" w:space="0" w:color="BFBFBF"/>
+              <w:bottom w:val="single" w:sz="4" w:space="0" w:color="BFBFBF"/>
+              <w:right w:val="single" w:sz="4" w:space="0" w:color="BFBFBF"/>
+            </w:tcBorders>
+          </w:tcPr>
+          <w:p>
+            <w:r/>
+            <w:r>
+              <w:rPr>
+                <w:b/>
+                <w:sz w:val="19"/>
+              </w:rPr>
+              <w:t>Draws</w:t>
+            </w:r>
+          </w:p>
+        </w:tc>
+        <w:tc>
+          <w:tcPr>
+            <w:tcW w:type="dxa" w:w="1944"/>
+            <w:tcBorders>
+              <w:top w:val="single" w:sz="4" w:space="0" w:color="BFBFBF"/>
+              <w:left w:val="single" w:sz="4" w:space="0" w:color="BFBFBF"/>
+              <w:bottom w:val="single" w:sz="4" w:space="0" w:color="BFBFBF"/>
+              <w:right w:val="single" w:sz="4" w:space="0" w:color="BFBFBF"/>
+            </w:tcBorders>
+          </w:tcPr>
+          <w:p>
+            <w:r/>
+            <w:r>
+              <w:rPr>
+                <w:b/>
+                <w:sz w:val="19"/>
+              </w:rPr>
+              <w:t>Top-20 rank retention (%)</w:t>
+            </w:r>
+          </w:p>
+        </w:tc>
+        <w:tc>
+          <w:tcPr>
+            <w:tcW w:type="dxa" w:w="1944"/>
+            <w:tcBorders>
+              <w:top w:val="single" w:sz="4" w:space="0" w:color="BFBFBF"/>
+              <w:left w:val="single" w:sz="4" w:space="0" w:color="BFBFBF"/>
+              <w:bottom w:val="single" w:sz="4" w:space="0" w:color="BFBFBF"/>
+              <w:right w:val="single" w:sz="4" w:space="0" w:color="BFBFBF"/>
+            </w:tcBorders>
+          </w:tcPr>
+          <w:p>
+            <w:r/>
+            <w:r>
+              <w:rPr>
+                <w:b/>
+                <w:sz w:val="19"/>
+              </w:rPr>
+              <w:t>Kendall τ vs base</w:t>
+            </w:r>
+          </w:p>
+        </w:tc>
+        <w:tc>
+          <w:tcPr>
+            <w:tcW w:type="dxa" w:w="1944"/>
+            <w:tcBorders>
+              <w:top w:val="single" w:sz="4" w:space="0" w:color="BFBFBF"/>
+              <w:left w:val="single" w:sz="4" w:space="0" w:color="BFBFBF"/>
+              <w:bottom w:val="single" w:sz="4" w:space="0" w:color="BFBFBF"/>
+              <w:right w:val="single" w:sz="4" w:space="0" w:color="BFBFBF"/>
+            </w:tcBorders>
+          </w:tcPr>
+          <w:p>
+            <w:r/>
+            <w:r>
+              <w:rPr>
+                <w:b/>
+                <w:sz w:val="19"/>
+              </w:rPr>
+              <w:t>Counties in stable core</w:t>
+            </w:r>
+          </w:p>
+        </w:tc>
+      </w:tr>
+      <w:tr>
+        <w:tc>
+          <w:tcPr>
+            <w:tcW w:type="dxa" w:w="1944"/>
+            <w:tcBorders>
+              <w:top w:val="single" w:sz="4" w:space="0" w:color="BFBFBF"/>
+              <w:left w:val="single" w:sz="4" w:space="0" w:color="BFBFBF"/>
+              <w:bottom w:val="single" w:sz="4" w:space="0" w:color="BFBFBF"/>
+              <w:right w:val="single" w:sz="4" w:space="0" w:color="BFBFBF"/>
+            </w:tcBorders>
+          </w:tcPr>
+          <w:p>
+            <w:r/>
+            <w:r>
+              <w:rPr>
+                <w:sz w:val="19"/>
+              </w:rPr>
+              <w:t>±10% all weights</w:t>
+            </w:r>
+          </w:p>
+        </w:tc>
+        <w:tc>
+          <w:tcPr>
+            <w:tcW w:type="dxa" w:w="1944"/>
+            <w:tcBorders>
+              <w:top w:val="single" w:sz="4" w:space="0" w:color="BFBFBF"/>
+              <w:left w:val="single" w:sz="4" w:space="0" w:color="BFBFBF"/>
+              <w:bottom w:val="single" w:sz="4" w:space="0" w:color="BFBFBF"/>
+              <w:right w:val="single" w:sz="4" w:space="0" w:color="BFBFBF"/>
+            </w:tcBorders>
+          </w:tcPr>
+          <w:p>
+            <w:r/>
+            <w:r>
+              <w:rPr>
+                <w:sz w:val="19"/>
+              </w:rPr>
+              <w:t>___</w:t>
+            </w:r>
+          </w:p>
+        </w:tc>
+        <w:tc>
+          <w:tcPr>
+            <w:tcW w:type="dxa" w:w="1944"/>
+            <w:tcBorders>
+              <w:top w:val="single" w:sz="4" w:space="0" w:color="BFBFBF"/>
+              <w:left w:val="single" w:sz="4" w:space="0" w:color="BFBFBF"/>
+              <w:bottom w:val="single" w:sz="4" w:space="0" w:color="BFBFBF"/>
+              <w:right w:val="single" w:sz="4" w:space="0" w:color="BFBFBF"/>
+            </w:tcBorders>
+          </w:tcPr>
+          <w:p>
+            <w:r/>
+            <w:r>
+              <w:rPr>
+                <w:sz w:val="19"/>
+              </w:rPr>
+              <w:t>___</w:t>
+            </w:r>
+          </w:p>
+        </w:tc>
+        <w:tc>
+          <w:tcPr>
+            <w:tcW w:type="dxa" w:w="1944"/>
+            <w:tcBorders>
+              <w:top w:val="single" w:sz="4" w:space="0" w:color="BFBFBF"/>
+              <w:left w:val="single" w:sz="4" w:space="0" w:color="BFBFBF"/>
+              <w:bottom w:val="single" w:sz="4" w:space="0" w:color="BFBFBF"/>
+              <w:right w:val="single" w:sz="4" w:space="0" w:color="BFBFBF"/>
+            </w:tcBorders>
+          </w:tcPr>
+          <w:p>
+            <w:r/>
+            <w:r>
+              <w:rPr>
+                <w:sz w:val="19"/>
+              </w:rPr>
+              <w:t>___</w:t>
+            </w:r>
+          </w:p>
+        </w:tc>
+        <w:tc>
+          <w:tcPr>
+            <w:tcW w:type="dxa" w:w="1944"/>
+            <w:tcBorders>
+              <w:top w:val="single" w:sz="4" w:space="0" w:color="BFBFBF"/>
+              <w:left w:val="single" w:sz="4" w:space="0" w:color="BFBFBF"/>
+              <w:bottom w:val="single" w:sz="4" w:space="0" w:color="BFBFBF"/>
+              <w:right w:val="single" w:sz="4" w:space="0" w:color="BFBFBF"/>
+            </w:tcBorders>
+          </w:tcPr>
+          <w:p>
+            <w:r/>
+            <w:r>
+              <w:rPr>
+                <w:sz w:val="19"/>
+              </w:rPr>
+              <w:t>___</w:t>
+            </w:r>
+          </w:p>
+        </w:tc>
+      </w:tr>
+      <w:tr>
+        <w:tc>
+          <w:tcPr>
+            <w:tcW w:type="dxa" w:w="1944"/>
+            <w:tcBorders>
+              <w:top w:val="single" w:sz="4" w:space="0" w:color="BFBFBF"/>
+              <w:left w:val="single" w:sz="4" w:space="0" w:color="BFBFBF"/>
+              <w:bottom w:val="single" w:sz="4" w:space="0" w:color="BFBFBF"/>
+              <w:right w:val="single" w:sz="4" w:space="0" w:color="BFBFBF"/>
+            </w:tcBorders>
+          </w:tcPr>
+          <w:p>
+            <w:r/>
+            <w:r>
+              <w:rPr>
+                <w:sz w:val="19"/>
+              </w:rPr>
+              <w:t>±25% all weights</w:t>
+            </w:r>
+          </w:p>
+        </w:tc>
+        <w:tc>
+          <w:tcPr>
+            <w:tcW w:type="dxa" w:w="1944"/>
+            <w:tcBorders>
+              <w:top w:val="single" w:sz="4" w:space="0" w:color="BFBFBF"/>
+              <w:left w:val="single" w:sz="4" w:space="0" w:color="BFBFBF"/>
+              <w:bottom w:val="single" w:sz="4" w:space="0" w:color="BFBFBF"/>
+              <w:right w:val="single" w:sz="4" w:space="0" w:color="BFBFBF"/>
+            </w:tcBorders>
+          </w:tcPr>
+          <w:p>
+            <w:r/>
+            <w:r>
+              <w:rPr>
+                <w:sz w:val="19"/>
+              </w:rPr>
+              <w:t>___</w:t>
+            </w:r>
+          </w:p>
+        </w:tc>
+        <w:tc>
+          <w:tcPr>
+            <w:tcW w:type="dxa" w:w="1944"/>
+            <w:tcBorders>
+              <w:top w:val="single" w:sz="4" w:space="0" w:color="BFBFBF"/>
+              <w:left w:val="single" w:sz="4" w:space="0" w:color="BFBFBF"/>
+              <w:bottom w:val="single" w:sz="4" w:space="0" w:color="BFBFBF"/>
+              <w:right w:val="single" w:sz="4" w:space="0" w:color="BFBFBF"/>
+            </w:tcBorders>
+          </w:tcPr>
+          <w:p>
+            <w:r/>
+            <w:r>
+              <w:rPr>
+                <w:sz w:val="19"/>
+              </w:rPr>
+              <w:t>___</w:t>
+            </w:r>
+          </w:p>
+        </w:tc>
+        <w:tc>
+          <w:tcPr>
+            <w:tcW w:type="dxa" w:w="1944"/>
+            <w:tcBorders>
+              <w:top w:val="single" w:sz="4" w:space="0" w:color="BFBFBF"/>
+              <w:left w:val="single" w:sz="4" w:space="0" w:color="BFBFBF"/>
+              <w:bottom w:val="single" w:sz="4" w:space="0" w:color="BFBFBF"/>
+              <w:right w:val="single" w:sz="4" w:space="0" w:color="BFBFBF"/>
+            </w:tcBorders>
+          </w:tcPr>
+          <w:p>
+            <w:r/>
+            <w:r>
+              <w:rPr>
+                <w:sz w:val="19"/>
+              </w:rPr>
+              <w:t>___</w:t>
+            </w:r>
+          </w:p>
+        </w:tc>
+        <w:tc>
+          <w:tcPr>
+            <w:tcW w:type="dxa" w:w="1944"/>
+            <w:tcBorders>
+              <w:top w:val="single" w:sz="4" w:space="0" w:color="BFBFBF"/>
+              <w:left w:val="single" w:sz="4" w:space="0" w:color="BFBFBF"/>
+              <w:bottom w:val="single" w:sz="4" w:space="0" w:color="BFBFBF"/>
+              <w:right w:val="single" w:sz="4" w:space="0" w:color="BFBFBF"/>
+            </w:tcBorders>
+          </w:tcPr>
+          <w:p>
+            <w:r/>
+            <w:r>
+              <w:rPr>
+                <w:sz w:val="19"/>
+              </w:rPr>
+              <w:t>___</w:t>
+            </w:r>
+          </w:p>
+        </w:tc>
+      </w:tr>
+    </w:tbl>
+    <w:p>
+      <w:r>
+        <w:rPr>
+          <w:b/>
+          <w:sz w:val="22"/>
+        </w:rPr>
+        <w:t xml:space="preserve">Position. </w:t>
+      </w:r>
+      <w:r>
+        <w:rPr>
+          <w:sz w:val="22"/>
+        </w:rPr>
+        <w:t>If retention is high, state that the decision does not hinge on the exact weights — this defuses "why 40/25/20/15?" If a subset is fragile, present the stable core (for example, "the 12 counties that never leave the top 20") rather than the full ranking.</w:t>
+      </w:r>
+    </w:p>
+    <w:p>
+      <w:pPr>
+        <w:pStyle w:val="Heading2"/>
+      </w:pPr>
+      <w:r>
+        <w:t>III.6  The Undiagnosed Pool as a Calibrated Interval</w:t>
+      </w:r>
+    </w:p>
+    <w:p>
+      <w:r>
+        <w:rPr>
+          <w:b/>
+          <w:sz w:val="22"/>
+        </w:rPr>
+        <w:t xml:space="preserve">Expose the chain. </w:t>
+      </w:r>
+      <w:r>
+        <w:rPr>
+          <w:sz w:val="22"/>
+        </w:rPr>
+        <w:t>The pool estimate is not a single number; it is a transparent product of sourced factors, and it is reported as an interval, never a point:</w:t>
+      </w:r>
+    </w:p>
+    <w:p>
+      <w:r>
+        <w:rPr>
+          <w:i/>
+          <w:sz w:val="22"/>
+        </w:rPr>
+        <w:t>Estimated undiagnosed pool  =  Adult population (ACS)  ×  Condition prevalence (PLACES)  ×  (1 − diagnosis/treatment-rate proxy)  ×  Published national undiagnosis rate</w:t>
+      </w:r>
+    </w:p>
+    <w:p>
+      <w:r>
+        <w:rPr>
+          <w:b/>
+          <w:sz w:val="22"/>
+        </w:rPr>
+        <w:t xml:space="preserve">Report as an interval. </w:t>
+      </w:r>
+      <w:r>
+        <w:rPr>
+          <w:sz w:val="22"/>
+        </w:rPr>
+        <w:t>Present a low–central–high band derived from the plausible range of the national undiagnosis rate and the prevalence confidence interval — e.g. "38k–52k, central 45k." A five-digit point count is the fastest way to lose a technical room: the third significant digit is not defensible on public data.</w:t>
+      </w:r>
+    </w:p>
+    <w:p>
+      <w:r>
+        <w:rPr>
+          <w:b/>
+          <w:sz w:val="22"/>
+        </w:rPr>
+        <w:t xml:space="preserve">Calibration plan. </w:t>
+      </w:r>
+      <w:r>
+        <w:rPr>
+          <w:sz w:val="22"/>
+        </w:rPr>
+        <w:t>The backdated IQVIA claims extract converts these public-data intervals from directional to calibrated — the realized diagnosed count in the historical window anchors the (1 − diagnosis rate) term to observed local reality rather than a national constant. Until then, the pool is labeled "directional — pending claims calibration" in the product.</w:t>
+      </w:r>
+    </w:p>
+    <w:p>
+      <w:pPr>
+        <w:pStyle w:val="Heading2"/>
+      </w:pPr>
+      <w:r>
+        <w:t>III.7  Ecological Fallacy &amp; Scope of Inference</w:t>
+      </w:r>
+    </w:p>
+    <w:p>
+      <w:r>
+        <w:rPr>
+          <w:b/>
+          <w:sz w:val="22"/>
+        </w:rPr>
+        <w:t xml:space="preserve">Name it first. </w:t>
+      </w:r>
+      <w:r>
+        <w:rPr>
+          <w:sz w:val="22"/>
+        </w:rPr>
+        <w:t>County- and ZIP-level associations do not transfer to individuals — the ecological fallacy. SPPF is scoped precisely to avoid it: it prioritizes geographies for program deployment and never identifies, scores, or implies anything about an individual patient. Raising this limitation before a reviewer does is the highest-credibility move available in a mixed business/technical room.</w:t>
+      </w:r>
+    </w:p>
+    <w:p>
+      <w:r>
+        <w:rPr>
+          <w:b/>
+          <w:sz w:val="22"/>
+        </w:rPr>
+        <w:t xml:space="preserve">The clean line vs patient-finding. </w:t>
+      </w:r>
+      <w:r>
+        <w:rPr>
+          <w:sz w:val="22"/>
+        </w:rPr>
+        <w:t>This is also the boundary between SPPF and claims/EMR patient-identification models: those answer who; SPPF answers where. They are complementary, not competitive — SPPF operates upstream, in the cold, where claims coverage is thin.</w:t>
+      </w:r>
+    </w:p>
+    <w:p>
+      <w:pPr>
+        <w:pStyle w:val="Heading2"/>
+      </w:pPr>
+      <w:r>
+        <w:t>III.8  Validation Roadmap &amp; the Data Ask</w:t>
+      </w:r>
+    </w:p>
+    <w:p>
+      <w:r>
+        <w:rPr>
+          <w:b/>
+          <w:sz w:val="22"/>
+        </w:rPr>
+        <w:t xml:space="preserve">Provable today (public data). </w:t>
+      </w:r>
+      <w:r>
+        <w:rPr>
+          <w:sz w:val="22"/>
+        </w:rPr>
+        <w:t>Baseline-lift (III.1), temporal coherence (III.2), external held-out source (III.3), incremental value over SDoH (III.4), and weight stability (III.5). None require client data; all should be complete before the first presentation.</w:t>
+      </w:r>
+    </w:p>
+    <w:p>
+      <w:r>
+        <w:rPr>
+          <w:b/>
+          <w:sz w:val="22"/>
+        </w:rPr>
+        <w:t xml:space="preserve">Unlocked by the backdated claims extract (the ask). </w:t>
+      </w:r>
+      <w:r>
+        <w:rPr>
+          <w:sz w:val="22"/>
+        </w:rPr>
+        <w:t>(1) Calibrate the undiagnosed-pool interval to observed local diagnosis reality; (2) the definitive test — does the public-data prioritization predict where diagnoses actually landed in the historical window, measured as Spearman ρ and precision @ k against realized claims-derived diagnosis counts, reported as lift over the naive baseline.</w:t>
+      </w:r>
+    </w:p>
+    <w:p>
+      <w:r>
+        <w:rPr>
+          <w:b/>
+          <w:sz w:val="22"/>
+        </w:rPr>
+        <w:t xml:space="preserve">Scoped to be granted. </w:t>
+      </w:r>
+      <w:r>
+        <w:rPr>
+          <w:sz w:val="22"/>
+        </w:rPr>
+        <w:t>Not warehouse access: one backdated extract, one condition (CKD or MASH), one or two states, historical window [T0 → T1]. One falsifiable test with a pre-stated kill criterion — if the public-data prioritization does not beat baseline at predicting realized diagnoses (Δρ ≤ 0), the undiagnosed-targeting thesis is not supported, and we say so.</w:t>
+      </w:r>
+    </w:p>
+    <w:p>
+      <w:r>
+        <w:rPr>
+          <w:b/>
+          <w:sz w:val="22"/>
+        </w:rPr>
+        <w:t xml:space="preserve">Reader’s note. </w:t>
+      </w:r>
+      <w:r>
+        <w:rPr>
+          <w:sz w:val="22"/>
+        </w:rPr>
+        <w:t>Every "___" in the tables above is a computed output, not a narrative choice. Populate from the validation scripts before presenting; do not enter numbers by hand.</w:t>
       </w:r>
     </w:p>
     <w:sectPr>

</xml_diff>

<commit_message>
feat: Part III validation harness — baseline lift, temporal coherence, held-out severity, incremental value, weight stability; fill methodology doc tables with computed values
Co-Authored-By: Claude Fable 5 <noreply@anthropic.com>
</commit_message>
<xml_diff>
--- a/SPPF_Methodology_v2.0.docx
+++ b/SPPF_Methodology_v2.0.docx
@@ -19144,7 +19144,7 @@
               <w:rPr>
                 <w:sz w:val="19"/>
               </w:rPr>
-              <w:t>___</w:t>
+              <w:t>−0.036</w:t>
             </w:r>
           </w:p>
         </w:tc>
@@ -19164,7 +19164,7 @@
               <w:rPr>
                 <w:sz w:val="19"/>
               </w:rPr>
-              <w:t>___</w:t>
+              <w:t>−0.091</w:t>
             </w:r>
           </w:p>
         </w:tc>
@@ -19184,7 +19184,7 @@
               <w:rPr>
                 <w:sz w:val="19"/>
               </w:rPr>
-              <w:t>___</w:t>
+              <w:t>−0.055</w:t>
             </w:r>
           </w:p>
         </w:tc>
@@ -19204,7 +19204,7 @@
               <w:rPr>
                 <w:sz w:val="19"/>
               </w:rPr>
-              <w:t>___</w:t>
+              <w:t>0.014</w:t>
             </w:r>
           </w:p>
         </w:tc>
@@ -19224,7 +19224,7 @@
               <w:rPr>
                 <w:sz w:val="19"/>
               </w:rPr>
-              <w:t>___</w:t>
+              <w:t>3,135</w:t>
             </w:r>
           </w:p>
         </w:tc>
@@ -19266,7 +19266,7 @@
               <w:rPr>
                 <w:sz w:val="19"/>
               </w:rPr>
-              <w:t>___</w:t>
+              <w:t>−0.027</w:t>
             </w:r>
           </w:p>
         </w:tc>
@@ -19286,7 +19286,7 @@
               <w:rPr>
                 <w:sz w:val="19"/>
               </w:rPr>
-              <w:t>___</w:t>
+              <w:t>−0.063</w:t>
             </w:r>
           </w:p>
         </w:tc>
@@ -19306,7 +19306,7 @@
               <w:rPr>
                 <w:sz w:val="19"/>
               </w:rPr>
-              <w:t>___</w:t>
+              <w:t>−0.036</w:t>
             </w:r>
           </w:p>
         </w:tc>
@@ -19326,7 +19326,7 @@
               <w:rPr>
                 <w:sz w:val="19"/>
               </w:rPr>
-              <w:t>___</w:t>
+              <w:t>0.016</w:t>
             </w:r>
           </w:p>
         </w:tc>
@@ -19346,7 +19346,7 @@
               <w:rPr>
                 <w:sz w:val="19"/>
               </w:rPr>
-              <w:t>___</w:t>
+              <w:t>3,135</w:t>
             </w:r>
           </w:p>
         </w:tc>
@@ -19388,7 +19388,7 @@
               <w:rPr>
                 <w:sz w:val="19"/>
               </w:rPr>
-              <w:t>___</w:t>
+              <w:t>0.25</w:t>
             </w:r>
           </w:p>
         </w:tc>
@@ -19408,7 +19408,7 @@
               <w:rPr>
                 <w:sz w:val="19"/>
               </w:rPr>
-              <w:t>___</w:t>
+              <w:t>0.55</w:t>
             </w:r>
           </w:p>
         </w:tc>
@@ -19428,7 +19428,7 @@
               <w:rPr>
                 <w:sz w:val="19"/>
               </w:rPr>
-              <w:t>___</w:t>
+              <w:t>+0.30</w:t>
             </w:r>
           </w:p>
         </w:tc>
@@ -19448,7 +19448,7 @@
               <w:rPr>
                 <w:sz w:val="19"/>
               </w:rPr>
-              <w:t>___</w:t>
+              <w:t>0.162</w:t>
             </w:r>
           </w:p>
         </w:tc>
@@ -19468,7 +19468,7 @@
               <w:rPr>
                 <w:sz w:val="19"/>
               </w:rPr>
-              <w:t>___</w:t>
+              <w:t>3,135</w:t>
             </w:r>
           </w:p>
         </w:tc>
@@ -19510,7 +19510,7 @@
               <w:rPr>
                 <w:sz w:val="19"/>
               </w:rPr>
-              <w:t>___</w:t>
+              <w:t>0.444</w:t>
             </w:r>
           </w:p>
         </w:tc>
@@ -19530,7 +19530,7 @@
               <w:rPr>
                 <w:sz w:val="19"/>
               </w:rPr>
-              <w:t>___</w:t>
+              <w:t>0.469</w:t>
             </w:r>
           </w:p>
         </w:tc>
@@ -19550,7 +19550,7 @@
               <w:rPr>
                 <w:sz w:val="19"/>
               </w:rPr>
-              <w:t>___</w:t>
+              <w:t>+0.024</w:t>
             </w:r>
           </w:p>
         </w:tc>
@@ -19570,7 +19570,7 @@
               <w:rPr>
                 <w:sz w:val="19"/>
               </w:rPr>
-              <w:t>___</w:t>
+              <w:t>0.099</w:t>
             </w:r>
           </w:p>
         </w:tc>
@@ -19590,7 +19590,7 @@
               <w:rPr>
                 <w:sz w:val="19"/>
               </w:rPr>
-              <w:t>___</w:t>
+              <w:t>3,135</w:t>
             </w:r>
           </w:p>
         </w:tc>
@@ -19805,7 +19805,7 @@
               <w:rPr>
                 <w:sz w:val="19"/>
               </w:rPr>
-              <w:t>___</w:t>
+              <w:t>314</w:t>
             </w:r>
           </w:p>
         </w:tc>
@@ -19825,7 +19825,7 @@
               <w:rPr>
                 <w:sz w:val="19"/>
               </w:rPr>
-              <w:t>___</w:t>
+              <w:t>+0.95 pp</w:t>
             </w:r>
           </w:p>
         </w:tc>
@@ -19845,7 +19845,7 @@
               <w:rPr>
                 <w:sz w:val="19"/>
               </w:rPr>
-              <w:t>___</w:t>
+              <w:t>+0.78 pp</w:t>
             </w:r>
           </w:p>
         </w:tc>
@@ -19865,7 +19865,7 @@
               <w:rPr>
                 <w:sz w:val="19"/>
               </w:rPr>
-              <w:t>___</w:t>
+              <w:t>0.11</w:t>
             </w:r>
           </w:p>
         </w:tc>
@@ -19907,7 +19907,7 @@
               <w:rPr>
                 <w:sz w:val="19"/>
               </w:rPr>
-              <w:t>___</w:t>
+              <w:t>2,508</w:t>
             </w:r>
           </w:p>
         </w:tc>
@@ -19927,7 +19927,7 @@
               <w:rPr>
                 <w:sz w:val="19"/>
               </w:rPr>
-              <w:t>___</w:t>
+              <w:t>+0.71 pp</w:t>
             </w:r>
           </w:p>
         </w:tc>
@@ -19947,7 +19947,7 @@
               <w:rPr>
                 <w:sz w:val="19"/>
               </w:rPr>
-              <w:t>___</w:t>
+              <w:t>+0.76 pp</w:t>
             </w:r>
           </w:p>
         </w:tc>
@@ -19967,7 +19967,7 @@
               <w:rPr>
                 <w:sz w:val="19"/>
               </w:rPr>
-              <w:t>___</w:t>
+              <w:t>−0.10</w:t>
             </w:r>
           </w:p>
         </w:tc>
@@ -20009,7 +20009,7 @@
               <w:rPr>
                 <w:sz w:val="19"/>
               </w:rPr>
-              <w:t>___</w:t>
+              <w:t>313</w:t>
             </w:r>
           </w:p>
         </w:tc>
@@ -20029,7 +20029,7 @@
               <w:rPr>
                 <w:sz w:val="19"/>
               </w:rPr>
-              <w:t>___</w:t>
+              <w:t>+1.10 pp</w:t>
             </w:r>
           </w:p>
         </w:tc>
@@ -20049,7 +20049,7 @@
               <w:rPr>
                 <w:sz w:val="19"/>
               </w:rPr>
-              <w:t>___</w:t>
+              <w:t>+0.88 pp</w:t>
             </w:r>
           </w:p>
         </w:tc>
@@ -20069,7 +20069,7 @@
               <w:rPr>
                 <w:sz w:val="19"/>
               </w:rPr>
-              <w:t>___</w:t>
+              <w:t>−0.06</w:t>
             </w:r>
           </w:p>
         </w:tc>
@@ -20276,7 +20276,7 @@
               <w:rPr>
                 <w:sz w:val="19"/>
               </w:rPr>
-              <w:t>___</w:t>
+              <w:t>state</w:t>
             </w:r>
           </w:p>
         </w:tc>
@@ -20296,7 +20296,7 @@
               <w:rPr>
                 <w:sz w:val="19"/>
               </w:rPr>
-              <w:t>___</w:t>
+              <w:t>pending</w:t>
             </w:r>
           </w:p>
         </w:tc>
@@ -20316,7 +20316,7 @@
               <w:rPr>
                 <w:sz w:val="19"/>
               </w:rPr>
-              <w:t>___</w:t>
+              <w:t>pending</w:t>
             </w:r>
           </w:p>
         </w:tc>
@@ -20336,7 +20336,7 @@
               <w:rPr>
                 <w:sz w:val="19"/>
               </w:rPr>
-              <w:t>___</w:t>
+              <w:t>pending</w:t>
             </w:r>
           </w:p>
         </w:tc>
@@ -20356,7 +20356,7 @@
               <w:rPr>
                 <w:sz w:val="19"/>
               </w:rPr>
-              <w:t>___</w:t>
+              <w:t>pending</w:t>
             </w:r>
           </w:p>
         </w:tc>
@@ -20398,7 +20398,7 @@
               <w:rPr>
                 <w:sz w:val="19"/>
               </w:rPr>
-              <w:t>___</w:t>
+              <w:t>county</w:t>
             </w:r>
           </w:p>
         </w:tc>
@@ -20418,7 +20418,7 @@
               <w:rPr>
                 <w:sz w:val="19"/>
               </w:rPr>
-              <w:t>___</w:t>
+              <w:t>3,144</w:t>
             </w:r>
           </w:p>
         </w:tc>
@@ -20438,7 +20438,7 @@
               <w:rPr>
                 <w:sz w:val="19"/>
               </w:rPr>
-              <w:t>___</w:t>
+              <w:t>0.470</w:t>
             </w:r>
           </w:p>
         </w:tc>
@@ -20458,7 +20458,7 @@
               <w:rPr>
                 <w:sz w:val="19"/>
               </w:rPr>
-              <w:t>___</w:t>
+              <w:t>−0.081</w:t>
             </w:r>
           </w:p>
         </w:tc>
@@ -20478,7 +20478,7 @@
               <w:rPr>
                 <w:sz w:val="19"/>
               </w:rPr>
-              <w:t>___</w:t>
+              <w:t>+0.551</w:t>
             </w:r>
           </w:p>
         </w:tc>
@@ -20693,7 +20693,7 @@
               <w:rPr>
                 <w:sz w:val="19"/>
               </w:rPr>
-              <w:t>___</w:t>
+              <w:t>0.227</w:t>
             </w:r>
           </w:p>
         </w:tc>
@@ -20795,7 +20795,7 @@
               <w:rPr>
                 <w:sz w:val="19"/>
               </w:rPr>
-              <w:t>___</w:t>
+              <w:t>0.426</w:t>
             </w:r>
           </w:p>
         </w:tc>
@@ -20815,7 +20815,7 @@
               <w:rPr>
                 <w:sz w:val="19"/>
               </w:rPr>
-              <w:t>___</w:t>
+              <w:t>+0.199</w:t>
             </w:r>
           </w:p>
         </w:tc>
@@ -20835,7 +20835,7 @@
               <w:rPr>
                 <w:sz w:val="19"/>
               </w:rPr>
-              <w:t>___</w:t>
+              <w:t>0.507</w:t>
             </w:r>
           </w:p>
         </w:tc>
@@ -20855,7 +20855,7 @@
               <w:rPr>
                 <w:sz w:val="19"/>
               </w:rPr>
-              <w:t>___</w:t>
+              <w:t>&lt;0.001</w:t>
             </w:r>
           </w:p>
         </w:tc>
@@ -20897,7 +20897,7 @@
               <w:rPr>
                 <w:sz w:val="19"/>
               </w:rPr>
-              <w:t>___</w:t>
+              <w:t>0.643</w:t>
             </w:r>
           </w:p>
         </w:tc>
@@ -20917,7 +20917,7 @@
               <w:rPr>
                 <w:sz w:val="19"/>
               </w:rPr>
-              <w:t>___</w:t>
+              <w:t>+0.416</w:t>
             </w:r>
           </w:p>
         </w:tc>
@@ -20937,7 +20937,7 @@
               <w:rPr>
                 <w:sz w:val="19"/>
               </w:rPr>
-              <w:t>___</w:t>
+              <w:t>—</w:t>
             </w:r>
           </w:p>
         </w:tc>
@@ -20957,7 +20957,7 @@
               <w:rPr>
                 <w:sz w:val="19"/>
               </w:rPr>
-              <w:t>___</w:t>
+              <w:t>—</w:t>
             </w:r>
           </w:p>
         </w:tc>
@@ -21157,7 +21157,7 @@
               <w:rPr>
                 <w:sz w:val="19"/>
               </w:rPr>
-              <w:t>___</w:t>
+              <w:t>2,000</w:t>
             </w:r>
           </w:p>
         </w:tc>
@@ -21177,7 +21177,7 @@
               <w:rPr>
                 <w:sz w:val="19"/>
               </w:rPr>
-              <w:t>___</w:t>
+              <w:t>96.8%</w:t>
             </w:r>
           </w:p>
         </w:tc>
@@ -21197,7 +21197,7 @@
               <w:rPr>
                 <w:sz w:val="19"/>
               </w:rPr>
-              <w:t>___</w:t>
+              <w:t>0.98</w:t>
             </w:r>
           </w:p>
         </w:tc>
@@ -21217,7 +21217,7 @@
               <w:rPr>
                 <w:sz w:val="19"/>
               </w:rPr>
-              <w:t>___</w:t>
+              <w:t>18 of 20</w:t>
             </w:r>
           </w:p>
         </w:tc>
@@ -21259,7 +21259,7 @@
               <w:rPr>
                 <w:sz w:val="19"/>
               </w:rPr>
-              <w:t>___</w:t>
+              <w:t>2,000</w:t>
             </w:r>
           </w:p>
         </w:tc>
@@ -21279,7 +21279,7 @@
               <w:rPr>
                 <w:sz w:val="19"/>
               </w:rPr>
-              <w:t>___</w:t>
+              <w:t>93.4%</w:t>
             </w:r>
           </w:p>
         </w:tc>
@@ -21299,7 +21299,7 @@
               <w:rPr>
                 <w:sz w:val="19"/>
               </w:rPr>
-              <w:t>___</w:t>
+              <w:t>0.95</w:t>
             </w:r>
           </w:p>
         </w:tc>
@@ -21319,7 +21319,7 @@
               <w:rPr>
                 <w:sz w:val="19"/>
               </w:rPr>
-              <w:t>___</w:t>
+              <w:t>15 of 20</w:t>
             </w:r>
           </w:p>
         </w:tc>
@@ -21506,6 +21506,14 @@
           <w:sz w:val="22"/>
         </w:rPr>
         <w:t>Every "___" in the tables above is a computed output, not a narrative choice. Populate from the validation scripts before presenting; do not enter numbers by hand.</w:t>
+      </w:r>
+    </w:p>
+    <w:p>
+      <w:r>
+        <w:rPr>
+          <w:i/>
+        </w:rPr>
+        <w:t xml:space="preserve">Computed results (public data, 2026-07-17; scripts: src/validation/). III.1: the kill criterion FIRES for the Δ-diagnosed-prevalence outcome — neither the composite nor any naive baseline predicts PLACES vintage-to-vintage deltas (all |ρ| &lt; 0.10; the dominant structure is regression to the mean in the model-smoothed estimates). No outcome-lift claim is made on public data; that test is exactly what the III.8 claims extract unlocks. What public data does establish: III.2 — the frozen 2020-vintage ranking is temporally coherent (ρ = 0.93, τ = 0.79, top-50 overlap 84% vs 1.6% by chance, n = 3,135); III.3 — the composite predicts a held-out severity measure it never ingests (CHR premature death: ρ = 0.47, p &lt; 10⁻¹⁷⁰, vs −0.08 for the naive baseline); III.4 — the Diagnosis Gap dimension adds ΔR² = +0.20 over an SDoH-only baseline (partial r = 0.51, p &lt; 0.001), so the score is not a repackaged deprivation index; III.5 — the top-20 ranking survives ±25% weight perturbation with 93.4% retention (15 of 20 counties stable in ≥90% of 2,000 draws).</w:t>
       </w:r>
     </w:p>
     <w:sectPr>

</xml_diff>